<commit_message>
docs: update uav stack architecture manual
</commit_message>
<xml_diff>
--- a/uav_stack_工程文件管理架构_中文手册.docx
+++ b/uav_stack_工程文件管理架构_中文手册.docx
@@ -1,390 +1,251 @@
 
 <file path=word/document.xml><?xml version="1.0" encoding="utf-8"?>
-<w:document xmlns:wpc="http://schemas.microsoft.com/office/word/2010/wordprocessingCanvas" xmlns:cx="http://schemas.microsoft.com/office/drawing/2014/chartex" xmlns:cx1="http://schemas.microsoft.com/office/drawing/2015/9/8/chartex" xmlns:cx2="http://schemas.microsoft.com/office/drawing/2015/10/21/chartex" xmlns:cx3="http://schemas.microsoft.com/office/drawing/2016/5/9/chartex" xmlns:cx4="http://schemas.microsoft.com/office/drawing/2016/5/10/chartex" xmlns:cx5="http://schemas.microsoft.com/office/drawing/2016/5/11/chartex" xmlns:cx6="http://schemas.microsoft.com/office/drawing/2016/5/12/chartex" xmlns:cx7="http://schemas.microsoft.com/office/drawing/2016/5/13/chartex" xmlns:cx8="http://schemas.microsoft.com/office/drawing/2016/5/14/chartex" xmlns:mc="http://schemas.openxmlformats.org/markup-compatibility/2006" xmlns:aink="http://schemas.microsoft.com/office/drawing/2016/ink" xmlns:am3d="http://schemas.microsoft.com/office/drawing/2017/model3d" xmlns:o="urn:schemas-microsoft-com:office:office" xmlns:oel="http://schemas.microsoft.com/office/2019/extlst" xmlns:r="http://schemas.openxmlformats.org/officeDocument/2006/relationships" xmlns:m="http://schemas.openxmlformats.org/officeDocument/2006/math" xmlns:v="urn:schemas-microsoft-com:vml" xmlns:wp14="http://schemas.microsoft.com/office/word/2010/wordprocessingDrawing" xmlns:wp="http://schemas.openxmlformats.org/drawingml/2006/wordprocessingDrawing" xmlns:w10="urn:schemas-microsoft-com:office:word" xmlns:w="http://schemas.openxmlformats.org/wordprocessingml/2006/main" xmlns:w14="http://schemas.microsoft.com/office/word/2010/wordml" xmlns:w15="http://schemas.microsoft.com/office/word/2012/wordml" xmlns:w16cex="http://schemas.microsoft.com/office/word/2018/wordml/cex" xmlns:w16cid="http://schemas.microsoft.com/office/word/2016/wordml/cid" xmlns:w16="http://schemas.microsoft.com/office/word/2018/wordml" xmlns:w16du="http://schemas.microsoft.com/office/word/2023/wordml/word16du" xmlns:w16sdtdh="http://schemas.microsoft.com/office/word/2020/wordml/sdtdatahash" xmlns:w16sdtfl="http://schemas.microsoft.com/office/word/2024/wordml/sdtformatlock" xmlns:w16se="http://schemas.microsoft.com/office/word/2015/wordml/symex" xmlns:wpg="http://schemas.microsoft.com/office/word/2010/wordprocessingGroup" xmlns:wpi="http://schemas.microsoft.com/office/word/2010/wordprocessingInk" xmlns:wne="http://schemas.microsoft.com/office/word/2006/wordml" xmlns:wps="http://schemas.microsoft.com/office/word/2010/wordprocessingShape" mc:Ignorable="w14 w15 w16se w16cid w16 w16cex w16sdtdh w16sdtfl w16du wp14">
+<w:document xmlns:ns1="http://schemas.openxmlformats.org/markup-compatibility/2006" xmlns:w="http://schemas.openxmlformats.org/wordprocessingml/2006/main" ns1:Ignorable="w14 w15 w16se w16cid w16 w16cex w16sdtdh w16sdtfl w16du wp14">
   <w:body>
     <w:p>
       <w:pPr>
         <w:pStyle w:val="MyTitle"/>
-        <w:jc w:val="center"/>
-        <w:rPr>
-          <w:lang w:eastAsia="zh-CN"/>
-        </w:rPr>
       </w:pPr>
       <w:r>
-        <w:rPr>
-          <w:lang w:eastAsia="zh-CN"/>
-        </w:rPr>
-        <w:t>机载电脑工程文件管理架构</w:t>
-      </w:r>
-      <w:r>
-        <w:rPr>
-          <w:lang w:eastAsia="zh-CN"/>
-        </w:rPr>
-        <w:br/>
-        <w:t>中文手册</w:t>
+        <w:t xml:space="preserve">uav_stack 工程文件管理架构中文手册</w:t>
       </w:r>
     </w:p>
     <w:p>
       <w:pPr>
         <w:pStyle w:val="MySubtitle"/>
-        <w:jc w:val="center"/>
       </w:pPr>
       <w:r>
-        <w:t>适用范围：ROS1 / PX4 / RealSense / VINS-Fusion / YOLO 机载识别</w:t>
-      </w:r>
-    </w:p>
-    <w:p/>
-    <w:tbl>
-      <w:tblPr>
-        <w:tblW w:w="0" w:type="auto"/>
-        <w:jc w:val="center"/>
-        <w:tblBorders>
-          <w:top w:val="single" w:sz="6" w:space="0" w:color="D0D7E5"/>
-          <w:left w:val="single" w:sz="6" w:space="0" w:color="D0D7E5"/>
-          <w:bottom w:val="single" w:sz="6" w:space="0" w:color="D0D7E5"/>
-          <w:right w:val="single" w:sz="6" w:space="0" w:color="D0D7E5"/>
-          <w:insideH w:val="single" w:sz="6" w:space="0" w:color="D0D7E5"/>
-          <w:insideV w:val="single" w:sz="6" w:space="0" w:color="D0D7E5"/>
-        </w:tblBorders>
-        <w:tblLayout w:type="fixed"/>
-        <w:tblLook w:val="04A0" w:firstRow="1" w:lastRow="0" w:firstColumn="1" w:lastColumn="0" w:noHBand="0" w:noVBand="1"/>
-      </w:tblPr>
-      <w:tblGrid>
-        <w:gridCol w:w="1984"/>
-        <w:gridCol w:w="6520"/>
-      </w:tblGrid>
-      <w:tr>
-        <w:trPr>
-          <w:jc w:val="center"/>
-        </w:trPr>
-        <w:tc>
-          <w:tcPr>
-            <w:tcW w:w="1984" w:type="dxa"/>
-            <w:shd w:val="clear" w:color="auto" w:fill="EAF0FB"/>
-            <w:tcMar>
-              <w:top w:w="120" w:type="dxa"/>
-              <w:left w:w="120" w:type="dxa"/>
-              <w:bottom w:w="120" w:type="dxa"/>
-              <w:right w:w="120" w:type="dxa"/>
-            </w:tcMar>
-            <w:vAlign w:val="center"/>
-          </w:tcPr>
-          <w:p>
-            <w:pPr>
-              <w:spacing w:after="0"/>
-            </w:pPr>
-            <w:r>
-              <w:rPr>
-                <w:b/>
-              </w:rPr>
-              <w:t>建议总目录</w:t>
-            </w:r>
-          </w:p>
-        </w:tc>
-        <w:tc>
-          <w:tcPr>
-            <w:tcW w:w="6520" w:type="dxa"/>
-            <w:tcMar>
-              <w:top w:w="120" w:type="dxa"/>
-              <w:left w:w="120" w:type="dxa"/>
-              <w:bottom w:w="120" w:type="dxa"/>
-              <w:right w:w="120" w:type="dxa"/>
-            </w:tcMar>
-            <w:vAlign w:val="center"/>
-          </w:tcPr>
-          <w:p>
-            <w:pPr>
-              <w:spacing w:after="0"/>
-            </w:pPr>
-            <w:r>
-              <w:t>~/projects/uav_stack/</w:t>
-            </w:r>
-          </w:p>
-        </w:tc>
-      </w:tr>
-      <w:tr>
-        <w:trPr>
-          <w:jc w:val="center"/>
-        </w:trPr>
-        <w:tc>
-          <w:tcPr>
-            <w:tcW w:w="1984" w:type="dxa"/>
-            <w:shd w:val="clear" w:color="auto" w:fill="EAF0FB"/>
-            <w:tcMar>
-              <w:top w:w="120" w:type="dxa"/>
-              <w:left w:w="120" w:type="dxa"/>
-              <w:bottom w:w="120" w:type="dxa"/>
-              <w:right w:w="120" w:type="dxa"/>
-            </w:tcMar>
-            <w:vAlign w:val="center"/>
-          </w:tcPr>
-          <w:p>
-            <w:pPr>
-              <w:spacing w:after="0"/>
-            </w:pPr>
-            <w:r>
-              <w:rPr>
-                <w:b/>
-              </w:rPr>
-              <w:t>定位</w:t>
-            </w:r>
-          </w:p>
-        </w:tc>
-        <w:tc>
-          <w:tcPr>
-            <w:tcW w:w="6520" w:type="dxa"/>
-            <w:tcMar>
-              <w:top w:w="120" w:type="dxa"/>
-              <w:left w:w="120" w:type="dxa"/>
-              <w:bottom w:w="120" w:type="dxa"/>
-              <w:right w:w="120" w:type="dxa"/>
-            </w:tcMar>
-            <w:vAlign w:val="center"/>
-          </w:tcPr>
-          <w:p>
-            <w:pPr>
-              <w:spacing w:after="0"/>
-              <w:rPr>
-                <w:lang w:eastAsia="zh-CN"/>
-              </w:rPr>
-            </w:pPr>
-            <w:r>
-              <w:rPr>
-                <w:lang w:eastAsia="zh-CN"/>
-              </w:rPr>
-              <w:t>中等精简版：层次清楚，后续可扩展，但不过度细分</w:t>
-            </w:r>
-          </w:p>
-        </w:tc>
-      </w:tr>
-    </w:tbl>
-    <w:p>
-      <w:pPr>
-        <w:rPr>
-          <w:lang w:eastAsia="zh-CN"/>
-        </w:rPr>
-      </w:pPr>
+        <w:t xml:space="preserve">适用范围：RK3588 / ROS1 / PX4 / RealSense D435i / VINS-Fusion / EGO-Planner</w:t>
+      </w:r>
     </w:p>
     <w:p>
       <w:pPr>
         <w:pStyle w:val="Note"/>
-        <w:jc w:val="center"/>
-        <w:rPr>
-          <w:lang w:eastAsia="zh-CN"/>
-        </w:rPr>
       </w:pPr>
       <w:r>
-        <w:rPr>
-          <w:lang w:eastAsia="zh-CN"/>
-        </w:rPr>
-        <w:t>用途：统一管理 ROS 包、第三方源码、模型、配置、脚本、数据、日志与文档。</w:t>
+        <w:t xml:space="preserve">更新时间：2026-04-11；来源：/home/orangepi/projects/uav_stack 当前仓库扫描。</w:t>
       </w:r>
     </w:p>
     <w:p>
       <w:pPr>
         <w:pStyle w:val="1"/>
-        <w:rPr>
-          <w:lang w:eastAsia="zh-CN"/>
-        </w:rPr>
       </w:pPr>
       <w:r>
-        <w:rPr>
-          <w:lang w:eastAsia="zh-CN"/>
-        </w:rPr>
-        <w:t>一、推荐架构</w:t>
+        <w:t xml:space="preserve">一、工程定位</w:t>
+      </w:r>
+    </w:p>
+    <w:p>
+      <w:r>
+        <w:t xml:space="preserve">本工程是面向机载电脑的 ROS1 无人机工程栈，当前仓库名称为 RK3588-Vins-FUSION-EGO-Planner_C35。工程主路径为 /home/orangepi/projects/uav_stack，GitHub 远程仓库为 git@github.com:FUNSKII55/RK3588-Vins-FUSION-EGO-Planner_C35.git。</w:t>
+      </w:r>
+    </w:p>
+    <w:p>
+      <w:r>
+        <w:t xml:space="preserve">当前核心链路是：RealSense 双目红外图像和 IMU 数据进入 VINS-Fusion，VINS 输出里程计后由 vins_mavros_bridge 转成 MAVROS/PX4 可接收的视觉位姿；EGO-Planner 源码位于 catkin 工作空间内，作为后续规划栈；third_party 中保留 librealsense 与 Ceres 源码。</w:t>
       </w:r>
     </w:p>
     <w:p>
       <w:pPr>
-        <w:rPr>
-          <w:lang w:eastAsia="zh-CN"/>
-        </w:rPr>
+        <w:pStyle w:val="1"/>
       </w:pPr>
       <w:r>
-        <w:rPr>
-          <w:lang w:eastAsia="zh-CN"/>
-        </w:rPr>
-        <w:t>从 ~ 家目录开始，建议使用如下结构：</w:t>
+        <w:t xml:space="preserve">二、当前顶层目录</w:t>
       </w:r>
     </w:p>
     <w:p>
       <w:pPr>
         <w:pStyle w:val="Mono"/>
-        <w:spacing w:before="120" w:after="120"/>
       </w:pPr>
       <w:r>
-        <w:t>~/</w:t>
+        <w:t xml:space="preserve">uav_stack/</w:t>
       </w:r>
       <w:r>
         <w:br/>
-        <w:t>├── projects/</w:t>
+      </w:r>
+      <w:r>
+        <w:t xml:space="preserve">├── README.md</w:t>
       </w:r>
       <w:r>
         <w:br/>
-        <w:t>│   └── uav_stack/</w:t>
+      </w:r>
+      <w:r>
+        <w:t xml:space="preserve">├── uav_stack_工程文件管理架构_中文手册.docx</w:t>
       </w:r>
       <w:r>
         <w:br/>
-        <w:t>│       ├── catkin_ws/</w:t>
+      </w:r>
+      <w:r>
+        <w:t xml:space="preserve">├── catkin_ws/</w:t>
       </w:r>
       <w:r>
         <w:br/>
-        <w:t>│       │   ├── src/</w:t>
+      </w:r>
+      <w:r>
+        <w:t xml:space="preserve">│   ├── src/</w:t>
       </w:r>
       <w:r>
         <w:br/>
-        <w:t>│       │   │   ├── mavros_bridge/</w:t>
+      </w:r>
+      <w:r>
+        <w:t xml:space="preserve">│   │   ├── VINS-Fusion/</w:t>
       </w:r>
       <w:r>
         <w:br/>
-        <w:t>│       │   │   ├── VINS-Fusion/</w:t>
+      </w:r>
+      <w:r>
+        <w:t xml:space="preserve">│   │   │   ├── camera_models/</w:t>
       </w:r>
       <w:r>
         <w:br/>
-        <w:t>│       │   │   ├── realsense-ros/</w:t>
+      </w:r>
+      <w:r>
+        <w:t xml:space="preserve">│   │   │   ├── vins_estimator/</w:t>
       </w:r>
       <w:r>
         <w:br/>
-        <w:t>│       │   │   ├── yolo_ros/</w:t>
+      </w:r>
+      <w:r>
+        <w:t xml:space="preserve">│   │   │   ├── loop_fusion/</w:t>
       </w:r>
       <w:r>
         <w:br/>
-        <w:t>│       │   │   └── your_pkg/</w:t>
+      </w:r>
+      <w:r>
+        <w:t xml:space="preserve">│   │   │   └── global_fusion/</w:t>
       </w:r>
       <w:r>
         <w:br/>
-        <w:t>│       │   ├── build/</w:t>
+      </w:r>
+      <w:r>
+        <w:t xml:space="preserve">│   │   ├── realsense-ros/</w:t>
       </w:r>
       <w:r>
         <w:br/>
-        <w:t>│       │   └── devel/</w:t>
+      </w:r>
+      <w:r>
+        <w:t xml:space="preserve">│   │   │   ├── realsense2_camera/</w:t>
       </w:r>
       <w:r>
         <w:br/>
-        <w:t>│       ├── third_party/</w:t>
+      </w:r>
+      <w:r>
+        <w:t xml:space="preserve">│   │   │   └── realsense2_description/</w:t>
       </w:r>
       <w:r>
         <w:br/>
-        <w:t>│       │   ├── librealsense/</w:t>
+      </w:r>
+      <w:r>
+        <w:t xml:space="preserve">│   │   ├── ego-planner/</w:t>
       </w:r>
       <w:r>
         <w:br/>
-        <w:t>│       │   ├── ceres-solver/</w:t>
+      </w:r>
+      <w:r>
+        <w:t xml:space="preserve">│   │   │   └── src/{planner,uav_simulator}/</w:t>
       </w:r>
       <w:r>
         <w:br/>
-        <w:t>│       │   ├── onnxruntime/</w:t>
+      </w:r>
+      <w:r>
+        <w:t xml:space="preserve">│   │   └── vins_mavros_bridge/</w:t>
       </w:r>
       <w:r>
         <w:br/>
-        <w:t>│       │   └── yolov5/</w:t>
+      </w:r>
+      <w:r>
+        <w:t xml:space="preserve">│   ├── build/              # catkin 编译产物，已由 .gitignore 排除</w:t>
       </w:r>
       <w:r>
         <w:br/>
-        <w:t>│       ├── models/</w:t>
+      </w:r>
+      <w:r>
+        <w:t xml:space="preserve">│   ├── devel/              # catkin 开发环境，已由 .gitignore 排除</w:t>
       </w:r>
       <w:r>
         <w:br/>
-        <w:t>│       │   ├── yolo/</w:t>
+      </w:r>
+      <w:r>
+        <w:t xml:space="preserve">│   └── frames.gv / frames.pdf</w:t>
       </w:r>
       <w:r>
         <w:br/>
-        <w:t>│       │   └── backup/</w:t>
+      </w:r>
+      <w:r>
+        <w:t xml:space="preserve">├── launch/                 # 根目录运行入口：相机、VINS、MAVROS、RViz、桥接</w:t>
       </w:r>
       <w:r>
         <w:br/>
-        <w:t>│       ├── config/</w:t>
+      </w:r>
+      <w:r>
+        <w:t xml:space="preserve">├── yaml/                   # VINS、PX4、相机内参等运行参数</w:t>
       </w:r>
       <w:r>
         <w:br/>
-        <w:t>│       │   ├── realsense/</w:t>
+      </w:r>
+      <w:r>
+        <w:t xml:space="preserve">├── config/                 # RViz 与按模块分类的配置目录</w:t>
       </w:r>
       <w:r>
         <w:br/>
-        <w:t>│       │   ├── vins/</w:t>
+      </w:r>
+      <w:r>
+        <w:t xml:space="preserve">├── scripts/                # 辅助脚本镜像</w:t>
       </w:r>
       <w:r>
         <w:br/>
-        <w:t>│       │   ├── px4/</w:t>
+      </w:r>
+      <w:r>
+        <w:t xml:space="preserve">├── third_party/            # 非 ROS 第三方源码：ceres-solver、librealsense</w:t>
       </w:r>
       <w:r>
         <w:br/>
-        <w:t>│       │   └── yolo/</w:t>
+      </w:r>
+      <w:r>
+        <w:t xml:space="preserve">├── models/                 # 模型文件区，模型大文件默认不进 git</w:t>
       </w:r>
       <w:r>
         <w:br/>
-        <w:t>│       ├── scripts/</w:t>
+      </w:r>
+      <w:r>
+        <w:t xml:space="preserve">├── data/                   # 数据集、标定、结果等运行数据</w:t>
       </w:r>
       <w:r>
         <w:br/>
-        <w:t>│       │   ├── start_camera.sh</w:t>
+      </w:r>
+      <w:r>
+        <w:t xml:space="preserve">├── bags/                   # 本机测试 rosbag，*.bag 默认不进 git</w:t>
       </w:r>
       <w:r>
         <w:br/>
-        <w:t>│       │   ├── start_vins.sh</w:t>
+      </w:r>
+      <w:r>
+        <w:t xml:space="preserve">├── docs/                   # 文档区</w:t>
       </w:r>
       <w:r>
         <w:br/>
-        <w:t>│       │   ├── start_yolo.sh</w:t>
+      </w:r>
+      <w:r>
+        <w:t xml:space="preserve">├── logs/                   # 本机日志，默认不进 git</w:t>
       </w:r>
       <w:r>
         <w:br/>
-        <w:t>│       │   ├── start_all.sh</w:t>
+      </w:r>
+      <w:r>
+        <w:t xml:space="preserve">├── tmp/                    # 临时文件区</w:t>
       </w:r>
       <w:r>
         <w:br/>
-        <w:t>│       │   └── record_bag.sh</w:t>
-      </w:r>
-      <w:r>
-        <w:br/>
-      </w:r>
-      <w:r>
-        <w:lastRenderedPageBreak/>
-        <w:t>│       ├── data/</w:t>
-      </w:r>
-      <w:r>
-        <w:br/>
-        <w:t>│       │   ├── rosbag/</w:t>
-      </w:r>
-      <w:r>
-        <w:br/>
-        <w:t>│       │   ├── calibration/</w:t>
-      </w:r>
-      <w:r>
-        <w:br/>
-        <w:t>│       │   ├── dataset/</w:t>
-      </w:r>
-      <w:r>
-        <w:br/>
-        <w:t>│       │   ├── result/</w:t>
-      </w:r>
-      <w:r>
-        <w:br/>
-        <w:t>│       │   └── video/</w:t>
-      </w:r>
-      <w:r>
-        <w:br/>
-        <w:t>│       ├── logs/</w:t>
-      </w:r>
-      <w:r>
-        <w:br/>
-        <w:t>│       ├── docs/</w:t>
-      </w:r>
-      <w:r>
-        <w:br/>
-        <w:t>│       ├── tmp/</w:t>
-      </w:r>
-      <w:r>
-        <w:br/>
-        <w:t>│       └── archive/</w:t>
-      </w:r>
-      <w:r>
-        <w:br/>
-        <w:t>├── Downloads/</w:t>
-      </w:r>
-      <w:r>
-        <w:br/>
-        <w:t>└── Desktop/</w:t>
+      </w:r>
+      <w:r>
+        <w:t xml:space="preserve">└── archive/                # 旧版本或废弃材料归档区</w:t>
+      </w:r>
+    </w:p>
+    <w:p>
+      <w:pPr>
+        <w:pStyle w:val="1"/>
+      </w:pPr>
+      <w:r>
+        <w:t xml:space="preserve">三、目录职责说明</w:t>
       </w:r>
     </w:p>
     <w:p>
@@ -392,112 +253,129 @@
         <w:pStyle w:val="21"/>
       </w:pPr>
       <w:r>
-        <w:t>推荐原则</w:t>
+        <w:t xml:space="preserve">1. catkin_ws/</w:t>
+      </w:r>
+    </w:p>
+    <w:p>
+      <w:r>
+        <w:t xml:space="preserve">ROS1 catkin 工作空间。src/ 只放 ROS 包；build/、devel/ 是生成物，不作为人工维护目录。当前 catkin_ws/.catkin_workspace 存在，说明该目录已按 ROS 工作空间组织。</w:t>
       </w:r>
     </w:p>
     <w:p>
       <w:pPr>
-        <w:pStyle w:val="a0"/>
+        <w:pStyle w:val="21"/>
       </w:pPr>
       <w:r>
-        <w:t>正式工程只收口到 ~/projects/uav_stack/ 下，不再散落在 ~ 根目录。</w:t>
+        <w:t xml:space="preserve">2. catkin_ws/src/VINS-Fusion/</w:t>
+      </w:r>
+    </w:p>
+    <w:p>
+      <w:r>
+        <w:t xml:space="preserve">视觉惯性里程计主体。camera_models 提供相机模型，vins_estimator 的 ROS 包名为 vins，loop_fusion 和 global_fusion 分别对应回环与全局融合模块。当前根目录 launch/vins_node.launch 直接启动 vins 包中的 vins_node。</w:t>
       </w:r>
     </w:p>
     <w:p>
       <w:pPr>
-        <w:pStyle w:val="a0"/>
+        <w:pStyle w:val="21"/>
       </w:pPr>
       <w:r>
-        <w:t>catkin_ws/src 只放 ROS 包；第三方源码不放进 ROS 工作空间。</w:t>
+        <w:t xml:space="preserve">3. catkin_ws/src/realsense-ros/</w:t>
+      </w:r>
+    </w:p>
+    <w:p>
+      <w:r>
+        <w:t xml:space="preserve">Intel RealSense ROS 驱动与模型描述。realsense2_camera 负责相机/IMU 数据发布；realsense2_description 提供 D400 系列模型描述。根目录 launch/rs_camera.launch 通过 include 调用 realsense2_camera/launch/rs_camera.launch。</w:t>
       </w:r>
     </w:p>
     <w:p>
       <w:pPr>
-        <w:pStyle w:val="a0"/>
-        <w:rPr>
-          <w:lang w:eastAsia="zh-CN"/>
-        </w:rPr>
+        <w:pStyle w:val="21"/>
       </w:pPr>
       <w:r>
-        <w:rPr>
-          <w:lang w:eastAsia="zh-CN"/>
-        </w:rPr>
-        <w:t>模型、数据、配置、脚本必须分开，后期排障和迁移会轻松很多。</w:t>
+        <w:t xml:space="preserve">4. catkin_ws/src/vins_mavros_bridge/</w:t>
+      </w:r>
+    </w:p>
+    <w:p>
+      <w:r>
+        <w:t xml:space="preserve">本工程自定义桥接包。vins_to_mavros.cpp 订阅 /vins_estimator/imu_propagate，将 nav_msgs/Odometry 转为 geometry_msgs/PoseStamped 并发布到 /mavros/vision_pose/pose；同时发布 base_link -&gt; camera_link 静态 TF，当前平移为 x=0.09、y=0.0、z=0.04。</w:t>
+      </w:r>
+    </w:p>
+    <w:p>
+      <w:r>
+        <w:t xml:space="preserve">该包还包含两个 Python 辅助脚本：camera_imu_optical_frame_to_FLU.py 将 /camera/imu 转成 /imu/data_flu，frame_id 设为 imu_link；set_mavros_message_interval.py 在 MAVROS 连接后设置指定 MAVLink 消息频率，px4.launch 中默认 message_id=32、rate=30Hz。</w:t>
+      </w:r>
+    </w:p>
+    <w:p>
+      <w:pPr>
+        <w:pStyle w:val="21"/>
+      </w:pPr>
+      <w:r>
+        <w:t xml:space="preserve">5. catkin_ws/src/ego-planner/</w:t>
+      </w:r>
+    </w:p>
+    <w:p>
+      <w:r>
+        <w:t xml:space="preserve">EGO-Planner 源码树。planner 下包含 bspline_opt、path_searching、plan_env、plan_manage、traj_utils；uav_simulator 下包含 quadrotor_msgs、pose_utils、odom_visualization、so3_control、so3_quadrotor_simulator、local_sensing、map_generator 等仿真和工具包。当前扫描到的根目录 launch 文件尚未直接调用 EGO-Planner。</w:t>
+      </w:r>
+    </w:p>
+    <w:p>
+      <w:pPr>
+        <w:pStyle w:val="21"/>
+      </w:pPr>
+      <w:r>
+        <w:t xml:space="preserve">6. launch/ 与 yaml/</w:t>
+      </w:r>
+    </w:p>
+    <w:p>
+      <w:r>
+        <w:t xml:space="preserve">launch/ 是当前整理出的运行入口层，yaml/ 是对应运行参数层。它们位于仓库根目录，便于机载运行时直接使用绝对路径；如果其他机器需要从 GitHub 克隆后直接复现，应确认这些入口文件是否已纳入 git。</w:t>
+      </w:r>
+    </w:p>
+    <w:p>
+      <w:pPr>
+        <w:pStyle w:val="21"/>
+      </w:pPr>
+      <w:r>
+        <w:t xml:space="preserve">7. third_party/</w:t>
+      </w:r>
+    </w:p>
+    <w:p>
+      <w:r>
+        <w:t xml:space="preserve">非 ROS 第三方源码区，当前包括 ceres-solver 与 librealsense。third_party/build/ 与 third_party/librealsense/build/ 属于构建产物，已由 .gitignore 排除。</w:t>
+      </w:r>
+    </w:p>
+    <w:p>
+      <w:pPr>
+        <w:pStyle w:val="21"/>
+      </w:pPr>
+      <w:r>
+        <w:t xml:space="preserve">8. bags/、data/、models/、logs/、tmp/、archive/</w:t>
+      </w:r>
+    </w:p>
+    <w:p>
+      <w:r>
+        <w:t xml:space="preserve">这些目录承载运行数据、模型、日志、临时文件和归档材料。当前 bags/ 下有 2026-04-11 的本机测试 rosbag；*.bag、模型大文件、日志和数据结果默认不提交到 git。</w:t>
       </w:r>
     </w:p>
     <w:p>
       <w:pPr>
         <w:pStyle w:val="1"/>
       </w:pPr>
-      <w:proofErr w:type="spellStart"/>
-      <w:r>
-        <w:t>二、中文说明手册</w:t>
-      </w:r>
-      <w:proofErr w:type="spellEnd"/>
+      <w:r>
+        <w:t xml:space="preserve">四、关键启动入口</w:t>
+      </w:r>
     </w:p>
     <w:p>
       <w:pPr>
         <w:pStyle w:val="21"/>
       </w:pPr>
       <w:r>
-        <w:t>1. catkin_ws/</w:t>
+        <w:t xml:space="preserve">1. RealSense 相机</w:t>
       </w:r>
     </w:p>
     <w:p>
       <w:r>
-        <w:t>ROS 工作空间。</w:t>
-      </w:r>
-    </w:p>
-    <w:p>
-      <w:pPr>
-        <w:pStyle w:val="a0"/>
-      </w:pPr>
-      <w:r>
-        <w:t>src/：只放 ROS 包，例如 VINS-Fusion、realsense-ros、mavros_bridge、yolo_ros。</w:t>
-      </w:r>
-    </w:p>
-    <w:p>
-      <w:pPr>
-        <w:pStyle w:val="a0"/>
-      </w:pPr>
-      <w:r>
-        <w:t>build/：编译中间文件。</w:t>
-      </w:r>
-    </w:p>
-    <w:p>
-      <w:pPr>
-        <w:pStyle w:val="a0"/>
-      </w:pPr>
-      <w:r>
-        <w:t>devel/：catkin 生成的开发环境与可执行产物。</w:t>
-      </w:r>
-    </w:p>
-    <w:p>
-      <w:pPr>
-        <w:pStyle w:val="a0"/>
-        <w:rPr>
-          <w:lang w:eastAsia="zh-CN"/>
-        </w:rPr>
-      </w:pPr>
-      <w:r>
-        <w:rPr>
-          <w:lang w:eastAsia="zh-CN"/>
-        </w:rPr>
-        <w:t xml:space="preserve">规则：不要把 </w:t>
-      </w:r>
-      <w:proofErr w:type="spellStart"/>
-      <w:r>
-        <w:rPr>
-          <w:lang w:eastAsia="zh-CN"/>
-        </w:rPr>
-        <w:t>rosbag</w:t>
-      </w:r>
-      <w:proofErr w:type="spellEnd"/>
-      <w:r>
-        <w:rPr>
-          <w:lang w:eastAsia="zh-CN"/>
-        </w:rPr>
-        <w:t>、模型、第三方源码丢进这里。</w:t>
+        <w:t xml:space="preserve">launch/rs_camera.launch 启动 realsense2_camera，camera 默认名为 camera，tf_prefix 默认随 camera。当前启用 infra1、infra2、gyro、accel；关闭 depth 和 color；IMU 融合方式为 linear_interpolation；enable_sync=true；红外分辨率为 640x480@30fps；publish_tf=true。</w:t>
       </w:r>
     </w:p>
     <w:p>
@@ -505,56 +383,12 @@
         <w:pStyle w:val="21"/>
       </w:pPr>
       <w:r>
-        <w:t xml:space="preserve">2. </w:t>
-      </w:r>
-      <w:proofErr w:type="spellStart"/>
-      <w:r>
-        <w:t>third_party</w:t>
-      </w:r>
-      <w:proofErr w:type="spellEnd"/>
-      <w:r>
-        <w:t>/</w:t>
+        <w:t xml:space="preserve">2. IMU 坐标转换</w:t>
       </w:r>
     </w:p>
     <w:p>
       <w:r>
-        <w:t>非 ROS 的第三方源码区。</w:t>
-      </w:r>
-    </w:p>
-    <w:p>
-      <w:pPr>
-        <w:pStyle w:val="a0"/>
-      </w:pPr>
-      <w:r>
-        <w:t>适合放 librealsense、ceres-solver、onnxruntime、yolov5 等源码仓库。</w:t>
-      </w:r>
-    </w:p>
-    <w:p>
-      <w:pPr>
-        <w:pStyle w:val="a0"/>
-        <w:rPr>
-          <w:lang w:eastAsia="zh-CN"/>
-        </w:rPr>
-      </w:pPr>
-      <w:r>
-        <w:rPr>
-          <w:lang w:eastAsia="zh-CN"/>
-        </w:rPr>
-        <w:t xml:space="preserve">这类内容通常需要单独编译、单独升级，和 </w:t>
-      </w:r>
-      <w:proofErr w:type="spellStart"/>
-      <w:r>
-        <w:rPr>
-          <w:lang w:eastAsia="zh-CN"/>
-        </w:rPr>
-        <w:t>catkin_ws</w:t>
-      </w:r>
-      <w:proofErr w:type="spellEnd"/>
-      <w:r>
-        <w:rPr>
-          <w:lang w:eastAsia="zh-CN"/>
-        </w:rPr>
-        <w:t xml:space="preserve"> 隔离更稳。</w:t>
+        <w:t xml:space="preserve">launch/imu_transform.launch 启动 vins_mavros_bridge/scripts/camera_imu_optical_frame_to_FLU.py，将 RealSense optical 风格 IMU 轴向转换为 FLU：/camera/imu -&gt; /imu/data_flu。</w:t>
       </w:r>
     </w:p>
     <w:p>
@@ -562,28 +396,12 @@
         <w:pStyle w:val="21"/>
       </w:pPr>
       <w:r>
-        <w:t>3. models/</w:t>
+        <w:t xml:space="preserve">3. VINS-Fusion</w:t>
       </w:r>
     </w:p>
     <w:p>
       <w:r>
-        <w:t>模型文件区。</w:t>
-      </w:r>
-    </w:p>
-    <w:p>
-      <w:pPr>
-        <w:pStyle w:val="a0"/>
-      </w:pPr>
-      <w:r>
-        <w:t>放 YOLO 的 .pt、.onnx、量化模型以及备份模型。</w:t>
-      </w:r>
-    </w:p>
-    <w:p>
-      <w:pPr>
-        <w:pStyle w:val="a0"/>
-      </w:pPr>
-      <w:r>
-        <w:t>建议常用模型放 yolo/，旧版本或回滚版本放 backup/。</w:t>
+        <w:t xml:space="preserve">launch/vins_node.launch 启动 pkg=vins、type=vins_node、name=vins_estimator，参数文件为 /home/orangepi/projects/uav_stack/yaml/realsense_stereo_imu_config.yaml。</w:t>
       </w:r>
     </w:p>
     <w:p>
@@ -591,69 +409,12 @@
         <w:pStyle w:val="21"/>
       </w:pPr>
       <w:r>
-        <w:t>4. config/</w:t>
+        <w:t xml:space="preserve">4. VINS 到 MAVROS 桥接</w:t>
       </w:r>
     </w:p>
     <w:p>
       <w:r>
-        <w:t>配置文件区。</w:t>
-      </w:r>
-    </w:p>
-    <w:p>
-      <w:pPr>
-        <w:pStyle w:val="a0"/>
-        <w:rPr>
-          <w:lang w:eastAsia="zh-CN"/>
-        </w:rPr>
-      </w:pPr>
-      <w:r>
-        <w:rPr>
-          <w:lang w:eastAsia="zh-CN"/>
-        </w:rPr>
-        <w:t xml:space="preserve">集中管理各项目的 </w:t>
-      </w:r>
-      <w:proofErr w:type="spellStart"/>
-      <w:r>
-        <w:rPr>
-          <w:lang w:eastAsia="zh-CN"/>
-        </w:rPr>
-        <w:t>yaml</w:t>
-      </w:r>
-      <w:proofErr w:type="spellEnd"/>
-      <w:r>
-        <w:rPr>
-          <w:lang w:eastAsia="zh-CN"/>
-        </w:rPr>
-        <w:t>、launch、参数记录和已验证版本。</w:t>
-      </w:r>
-    </w:p>
-    <w:p>
-      <w:pPr>
-        <w:pStyle w:val="a0"/>
-      </w:pPr>
-      <w:proofErr w:type="spellStart"/>
-      <w:r>
-        <w:t>建议按</w:t>
-      </w:r>
-      <w:proofErr w:type="spellEnd"/>
-      <w:r>
-        <w:t xml:space="preserve"> </w:t>
-      </w:r>
-      <w:proofErr w:type="spellStart"/>
-      <w:r>
-        <w:t>realsense</w:t>
-      </w:r>
-      <w:proofErr w:type="spellEnd"/>
-      <w:r>
-        <w:t xml:space="preserve"> / </w:t>
-      </w:r>
-      <w:proofErr w:type="spellStart"/>
-      <w:r>
-        <w:t>vins</w:t>
-      </w:r>
-      <w:proofErr w:type="spellEnd"/>
-      <w:r>
-        <w:t xml:space="preserve"> / px4 / yolo 分类，方便回溯。</w:t>
+        <w:t xml:space="preserve">launch/vins_to_mavros.launch 启动 vins_mavros_bridge/vins_to_mavros，把 VINS 的 /vins_estimator/imu_propagate 转发到 /mavros/vision_pose/pose，供 PX4 EKF 作为视觉位姿输入。</w:t>
       </w:r>
     </w:p>
     <w:p>
@@ -661,35 +422,12 @@
         <w:pStyle w:val="21"/>
       </w:pPr>
       <w:r>
-        <w:lastRenderedPageBreak/>
-        <w:t>5. scripts/</w:t>
+        <w:t xml:space="preserve">5. MAVROS / PX4</w:t>
       </w:r>
     </w:p>
     <w:p>
       <w:r>
-        <w:t>脚本区。</w:t>
-      </w:r>
-    </w:p>
-    <w:p>
-      <w:pPr>
-        <w:pStyle w:val="a0"/>
-        <w:rPr>
-          <w:lang w:eastAsia="zh-CN"/>
-        </w:rPr>
-      </w:pPr>
-      <w:r>
-        <w:rPr>
-          <w:lang w:eastAsia="zh-CN"/>
-        </w:rPr>
-        <w:t>存放一键启动、录包、环境加载、辅助检查脚本。</w:t>
-      </w:r>
-    </w:p>
-    <w:p>
-      <w:pPr>
-        <w:pStyle w:val="a0"/>
-      </w:pPr>
-      <w:r>
-        <w:t>典型脚本：start_camera.sh、start_vins.sh、start_yolo.sh、record_bag.sh。</w:t>
+        <w:t xml:space="preserve">launch/px4.launch 启动 mavros_node，默认 fcu_url=/dev/ttyUSB0:921600，加载 yaml/px4_pluginlists.yaml 与 yaml/px4_config.yaml，并把 /tf_static remap 到 /mavros/tf_static_hidden 以减少 TF 冲突。</w:t>
       </w:r>
     </w:p>
     <w:p>
@@ -697,86 +435,143 @@
         <w:pStyle w:val="21"/>
       </w:pPr>
       <w:r>
-        <w:t>6. data/</w:t>
+        <w:t xml:space="preserve">6. RViz</w:t>
       </w:r>
     </w:p>
     <w:p>
       <w:r>
-        <w:t>数据区。</w:t>
+        <w:t xml:space="preserve">launch/vins_rviz.launch 启动 rviz，默认配置文件为 catkin_ws/src/VINS-Fusion/config/vins_rviz_config.rviz。config/vins_tf.rviz 也作为本机 TF/可视化配置存在。</w:t>
       </w:r>
     </w:p>
     <w:p>
       <w:pPr>
-        <w:pStyle w:val="a0"/>
-        <w:rPr>
-          <w:lang w:eastAsia="zh-CN"/>
-        </w:rPr>
+        <w:pStyle w:val="1"/>
       </w:pPr>
-      <w:proofErr w:type="spellStart"/>
-      <w:r>
-        <w:rPr>
-          <w:lang w:eastAsia="zh-CN"/>
-        </w:rPr>
-        <w:t>rosbag</w:t>
-      </w:r>
-      <w:proofErr w:type="spellEnd"/>
-      <w:r>
-        <w:rPr>
-          <w:lang w:eastAsia="zh-CN"/>
-        </w:rPr>
-        <w:t>/：现场录包。</w:t>
+      <w:r>
+        <w:t xml:space="preserve">五、当前数据流和 TF 关系</w:t>
       </w:r>
     </w:p>
     <w:p>
       <w:pPr>
-        <w:pStyle w:val="a0"/>
+        <w:pStyle w:val="Mono"/>
       </w:pPr>
       <w:r>
-        <w:t>calibration/：</w:t>
-      </w:r>
-      <w:proofErr w:type="spellStart"/>
-      <w:r>
-        <w:t>相机、IMU、外参标定文件</w:t>
-      </w:r>
-      <w:proofErr w:type="spellEnd"/>
-      <w:r>
-        <w:t>。</w:t>
+        <w:t xml:space="preserve">RealSense D435i</w:t>
+      </w:r>
+      <w:r>
+        <w:br/>
+      </w:r>
+      <w:r>
+        <w:t xml:space="preserve">  ├─ /camera/infra1/image_rect_raw</w:t>
+      </w:r>
+      <w:r>
+        <w:br/>
+      </w:r>
+      <w:r>
+        <w:t xml:space="preserve">  ├─ /camera/infra2/image_rect_raw</w:t>
+      </w:r>
+      <w:r>
+        <w:br/>
+      </w:r>
+      <w:r>
+        <w:t xml:space="preserve">  └─ /camera/imu</w:t>
+      </w:r>
+      <w:r>
+        <w:br/>
+      </w:r>
+      <w:r>
+        <w:t xml:space="preserve">        │</w:t>
+      </w:r>
+      <w:r>
+        <w:br/>
+      </w:r>
+      <w:r>
+        <w:t xml:space="preserve">        ├─ 可选：imu_transform -&gt; /imu/data_flu, frame_id=imu_link</w:t>
+      </w:r>
+      <w:r>
+        <w:br/>
+      </w:r>
+      <w:r>
+        <w:t xml:space="preserve">        │</w:t>
+      </w:r>
+      <w:r>
+        <w:br/>
+      </w:r>
+      <w:r>
+        <w:t xml:space="preserve">        ▼</w:t>
+      </w:r>
+      <w:r>
+        <w:br/>
+      </w:r>
+      <w:r>
+        <w:t xml:space="preserve">VINS-Fusion vins_node</w:t>
+      </w:r>
+      <w:r>
+        <w:br/>
+      </w:r>
+      <w:r>
+        <w:t xml:space="preserve">  └─ /vins_estimator/imu_propagate</w:t>
+      </w:r>
+      <w:r>
+        <w:br/>
+      </w:r>
+      <w:r>
+        <w:t xml:space="preserve">        │</w:t>
+      </w:r>
+      <w:r>
+        <w:br/>
+      </w:r>
+      <w:r>
+        <w:t xml:space="preserve">        ▼</w:t>
+      </w:r>
+      <w:r>
+        <w:br/>
+      </w:r>
+      <w:r>
+        <w:t xml:space="preserve">vins_mavros_bridge/vins_to_mavros</w:t>
+      </w:r>
+      <w:r>
+        <w:br/>
+      </w:r>
+      <w:r>
+        <w:t xml:space="preserve">  ├─ /mavros/vision_pose/pose</w:t>
+      </w:r>
+      <w:r>
+        <w:br/>
+      </w:r>
+      <w:r>
+        <w:t xml:space="preserve">  └─ static TF: base_link -&gt; camera_link, translation=(0.09, 0.0, 0.04)</w:t>
+      </w:r>
+      <w:r>
+        <w:br/>
+      </w:r>
+      <w:r>
+        <w:t xml:space="preserve">        │</w:t>
+      </w:r>
+      <w:r>
+        <w:br/>
+      </w:r>
+      <w:r>
+        <w:t xml:space="preserve">        ▼</w:t>
+      </w:r>
+      <w:r>
+        <w:br/>
+      </w:r>
+      <w:r>
+        <w:t xml:space="preserve">MAVROS / PX4 EKF</w:t>
+      </w:r>
+    </w:p>
+    <w:p>
+      <w:r>
+        <w:t xml:space="preserve">主要坐标帧包括 map、base_link、camera_link、imu_link 以及 RealSense 驱动发布的 camera 前缀相关帧。MAVROS 配置中 local_position 的 TF 输出为 map -&gt; base_link。</w:t>
       </w:r>
     </w:p>
     <w:p>
       <w:pPr>
-        <w:pStyle w:val="a0"/>
+        <w:pStyle w:val="1"/>
       </w:pPr>
       <w:r>
-        <w:t>dataset/：公开数据集或训练集，例如 EuRoC、YOLO 数据集。</w:t>
-      </w:r>
-    </w:p>
-    <w:p>
-      <w:pPr>
-        <w:pStyle w:val="a0"/>
-        <w:rPr>
-          <w:lang w:eastAsia="zh-CN"/>
-        </w:rPr>
-      </w:pPr>
-      <w:r>
-        <w:rPr>
-          <w:lang w:eastAsia="zh-CN"/>
-        </w:rPr>
-        <w:t>result/：推理结果、轨迹结果、评估结果。</w:t>
-      </w:r>
-    </w:p>
-    <w:p>
-      <w:pPr>
-        <w:pStyle w:val="a0"/>
-        <w:rPr>
-          <w:lang w:eastAsia="zh-CN"/>
-        </w:rPr>
-      </w:pPr>
-      <w:r>
-        <w:rPr>
-          <w:lang w:eastAsia="zh-CN"/>
-        </w:rPr>
-        <w:t>video/：原始视频或测试视频。</w:t>
+        <w:t xml:space="preserve">六、关键参数文件</w:t>
       </w:r>
     </w:p>
     <w:p>
@@ -784,58 +579,17 @@
         <w:pStyle w:val="21"/>
       </w:pPr>
       <w:r>
-        <w:t>7. logs/</w:t>
+        <w:t xml:space="preserve">1. yaml/realsense_stereo_imu_config.yaml</w:t>
       </w:r>
     </w:p>
     <w:p>
       <w:r>
-        <w:t>日志区。</w:t>
+        <w:t xml:space="preserve">VINS 双目 + IMU 配置。当前 imu=1、num_of_cam=2，IMU topic 为 /camera/imu，双目图像 topic 为 /camera/infra1/image_rect_raw 和 /camera/infra2/image_rect_raw，图像尺寸 640x480，cam0_calib=left.yaml，cam1_calib=right.yaml。</w:t>
       </w:r>
     </w:p>
     <w:p>
-      <w:pPr>
-        <w:pStyle w:val="a0"/>
-        <w:rPr>
-          <w:lang w:eastAsia="zh-CN"/>
-        </w:rPr>
-      </w:pPr>
-      <w:r>
-        <w:rPr>
-          <w:lang w:eastAsia="zh-CN"/>
-        </w:rPr>
-        <w:t>保存运行日志、训练日志、调试日志。</w:t>
-      </w:r>
-    </w:p>
-    <w:p>
-      <w:pPr>
-        <w:pStyle w:val="a0"/>
-      </w:pPr>
-      <w:r>
-        <w:t xml:space="preserve">ROS </w:t>
-      </w:r>
-      <w:proofErr w:type="spellStart"/>
-      <w:r>
-        <w:t>默认日志仍可能在</w:t>
-      </w:r>
-      <w:proofErr w:type="spellEnd"/>
-      <w:r>
-        <w:t xml:space="preserve"> ~/.</w:t>
-      </w:r>
-      <w:proofErr w:type="spellStart"/>
-      <w:r>
-        <w:t>ros</w:t>
-      </w:r>
-      <w:proofErr w:type="spellEnd"/>
-      <w:r>
-        <w:t>/</w:t>
-      </w:r>
-      <w:proofErr w:type="spellStart"/>
-      <w:r>
-        <w:t>log，这里更适合放你主动整理的日志</w:t>
-      </w:r>
-      <w:proofErr w:type="spellEnd"/>
-      <w:r>
-        <w:t>。</w:t>
+      <w:r>
+        <w:t xml:space="preserve">当前 estimate_extrinsic=1、estimate_td=1，表示外参和时间偏移允许在线估计。噪声参数为 acc_n=0.01、gyr_n=0.001、acc_w=0.0001、gyr_w=0.0001、g_norm=9.805。output_path 与 pose_graph_save_path 仍指向 /home/dji/output/，在 orangepi 用户环境下建议确认该目录是否存在。</w:t>
       </w:r>
     </w:p>
     <w:p>
@@ -843,40 +597,12 @@
         <w:pStyle w:val="21"/>
       </w:pPr>
       <w:r>
-        <w:t>8. docs/</w:t>
+        <w:t xml:space="preserve">2. yaml/left.yaml 与 yaml/right.yaml</w:t>
       </w:r>
     </w:p>
     <w:p>
       <w:r>
-        <w:t>文档区。</w:t>
-      </w:r>
-    </w:p>
-    <w:p>
-      <w:pPr>
-        <w:pStyle w:val="a0"/>
-        <w:rPr>
-          <w:lang w:eastAsia="zh-CN"/>
-        </w:rPr>
-      </w:pPr>
-      <w:r>
-        <w:rPr>
-          <w:lang w:eastAsia="zh-CN"/>
-        </w:rPr>
-        <w:t>存放安装记录、topic 清单、TF 树说明、参数说明、排障笔记。</w:t>
-      </w:r>
-    </w:p>
-    <w:p>
-      <w:pPr>
-        <w:pStyle w:val="a0"/>
-        <w:rPr>
-          <w:lang w:eastAsia="zh-CN"/>
-        </w:rPr>
-      </w:pPr>
-      <w:r>
-        <w:rPr>
-          <w:lang w:eastAsia="zh-CN"/>
-        </w:rPr>
-        <w:t>后续复现环境时，这一层非常有价值。</w:t>
+        <w:t xml:space="preserve">双目相机内参文件。当前模型为 PINHOLE，图像尺寸 640x480，畸变参数 k1/k2/p1/p2 均为 0.0，投影参数 fx=385.7544860839844、fy=385.7544860839844、cx=323.1204833984375、cy=236.7432098388672。</w:t>
       </w:r>
     </w:p>
     <w:p>
@@ -884,47 +610,12 @@
         <w:pStyle w:val="21"/>
       </w:pPr>
       <w:r>
-        <w:t xml:space="preserve">9. </w:t>
-      </w:r>
-      <w:proofErr w:type="spellStart"/>
-      <w:r>
-        <w:t>tmp</w:t>
-      </w:r>
-      <w:proofErr w:type="spellEnd"/>
-      <w:r>
-        <w:t>/</w:t>
+        <w:t xml:space="preserve">3. yaml/px4_config.yaml</w:t>
       </w:r>
     </w:p>
     <w:p>
       <w:r>
-        <w:t>临时文件区。</w:t>
-      </w:r>
-    </w:p>
-    <w:p>
-      <w:pPr>
-        <w:pStyle w:val="a0"/>
-        <w:rPr>
-          <w:lang w:eastAsia="zh-CN"/>
-        </w:rPr>
-      </w:pPr>
-      <w:r>
-        <w:rPr>
-          <w:lang w:eastAsia="zh-CN"/>
-        </w:rPr>
-        <w:t>临时导出、中间结果、短期测试文件先放这里。</w:t>
-      </w:r>
-    </w:p>
-    <w:p>
-      <w:pPr>
-        <w:pStyle w:val="a0"/>
-      </w:pPr>
-      <w:proofErr w:type="spellStart"/>
-      <w:r>
-        <w:t>确认有用后再归档到</w:t>
-      </w:r>
-      <w:proofErr w:type="spellEnd"/>
-      <w:r>
-        <w:t xml:space="preserve"> data / models / docs。</w:t>
+        <w:t xml:space="preserve">MAVROS/PX4 主配置。local_position frame_id=map，child_frame_id=base_link，tf/send=true；global_position 也使用 map 与 base_link；vision_pose/tf/listen=false，表示视觉位姿主要通过 /mavros/vision_pose/pose topic 输入，而不是由 MAVROS 监听 TF 自动生成。</w:t>
       </w:r>
     </w:p>
     <w:p>
@@ -932,1992 +623,127 @@
         <w:pStyle w:val="21"/>
       </w:pPr>
       <w:r>
-        <w:t>10. archive/</w:t>
+        <w:t xml:space="preserve">4. yaml/px4_pluginlists.yaml</w:t>
       </w:r>
     </w:p>
     <w:p>
       <w:r>
-        <w:t>归档区。</w:t>
-      </w:r>
-    </w:p>
-    <w:p>
-      <w:pPr>
-        <w:pStyle w:val="a0"/>
-        <w:rPr>
-          <w:lang w:eastAsia="zh-CN"/>
-        </w:rPr>
-      </w:pPr>
-      <w:r>
-        <w:rPr>
-          <w:lang w:eastAsia="zh-CN"/>
-        </w:rPr>
-        <w:t>旧模型、旧配置、旧 bag、废弃脚本都放这里。</w:t>
-      </w:r>
-    </w:p>
-    <w:p>
-      <w:pPr>
-        <w:pStyle w:val="a0"/>
-        <w:rPr>
-          <w:lang w:eastAsia="zh-CN"/>
-        </w:rPr>
-      </w:pPr>
-      <w:r>
-        <w:rPr>
-          <w:lang w:eastAsia="zh-CN"/>
-        </w:rPr>
-        <w:t>不要一改坏就直接删，先归档，便于回滚。</w:t>
+        <w:t xml:space="preserve">MAVROS 插件过滤配置。当前黑名单包括 safety_area、image_pub、vibration、distance_sensor、rangefinder、wheel_odometry；plugin_whitelist 为空。</w:t>
       </w:r>
     </w:p>
     <w:p>
       <w:pPr>
         <w:pStyle w:val="1"/>
-        <w:rPr>
-          <w:lang w:eastAsia="zh-CN"/>
-        </w:rPr>
       </w:pPr>
       <w:r>
-        <w:rPr>
-          <w:lang w:eastAsia="zh-CN"/>
-        </w:rPr>
-        <w:t>三、每一层文件夹的中文翻译</w:t>
+        <w:t xml:space="preserve">七、建议启动顺序</w:t>
       </w:r>
     </w:p>
-    <w:tbl>
-      <w:tblPr>
-        <w:tblStyle w:val="aff1"/>
-        <w:tblW w:w="0" w:type="auto"/>
-        <w:jc w:val="center"/>
-        <w:tblBorders>
-          <w:top w:val="single" w:sz="6" w:space="0" w:color="C7D5EA"/>
-          <w:left w:val="single" w:sz="6" w:space="0" w:color="C7D5EA"/>
-          <w:bottom w:val="single" w:sz="6" w:space="0" w:color="C7D5EA"/>
-          <w:right w:val="single" w:sz="6" w:space="0" w:color="C7D5EA"/>
-          <w:insideH w:val="single" w:sz="6" w:space="0" w:color="C7D5EA"/>
-          <w:insideV w:val="single" w:sz="6" w:space="0" w:color="C7D5EA"/>
-        </w:tblBorders>
-        <w:tblLook w:val="04A0" w:firstRow="1" w:lastRow="0" w:firstColumn="1" w:lastColumn="0" w:noHBand="0" w:noVBand="1"/>
-      </w:tblPr>
-      <w:tblGrid>
-        <w:gridCol w:w="2889"/>
-        <w:gridCol w:w="2783"/>
-        <w:gridCol w:w="4058"/>
-      </w:tblGrid>
-      <w:tr>
-        <w:trPr>
-          <w:jc w:val="center"/>
-        </w:trPr>
-        <w:tc>
-          <w:tcPr>
-            <w:tcW w:w="3249" w:type="dxa"/>
-            <w:shd w:val="clear" w:color="auto" w:fill="DCE6F1"/>
-            <w:tcMar>
-              <w:top w:w="120" w:type="dxa"/>
-              <w:left w:w="120" w:type="dxa"/>
-              <w:bottom w:w="120" w:type="dxa"/>
-              <w:right w:w="120" w:type="dxa"/>
-            </w:tcMar>
-            <w:vAlign w:val="center"/>
-          </w:tcPr>
-          <w:p>
-            <w:pPr>
-              <w:jc w:val="center"/>
-            </w:pPr>
-            <w:proofErr w:type="spellStart"/>
-            <w:r>
-              <w:rPr>
-                <w:b/>
-              </w:rPr>
-              <w:t>英文目录名</w:t>
-            </w:r>
-            <w:proofErr w:type="spellEnd"/>
-          </w:p>
-        </w:tc>
-        <w:tc>
-          <w:tcPr>
-            <w:tcW w:w="3249" w:type="dxa"/>
-            <w:shd w:val="clear" w:color="auto" w:fill="DCE6F1"/>
-            <w:tcMar>
-              <w:top w:w="120" w:type="dxa"/>
-              <w:left w:w="120" w:type="dxa"/>
-              <w:bottom w:w="120" w:type="dxa"/>
-              <w:right w:w="120" w:type="dxa"/>
-            </w:tcMar>
-            <w:vAlign w:val="center"/>
-          </w:tcPr>
-          <w:p>
-            <w:pPr>
-              <w:jc w:val="center"/>
-            </w:pPr>
-            <w:r>
-              <w:rPr>
-                <w:b/>
-              </w:rPr>
-              <w:t>中文翻译</w:t>
-            </w:r>
-          </w:p>
-        </w:tc>
-        <w:tc>
-          <w:tcPr>
-            <w:tcW w:w="3249" w:type="dxa"/>
-            <w:shd w:val="clear" w:color="auto" w:fill="DCE6F1"/>
-            <w:tcMar>
-              <w:top w:w="120" w:type="dxa"/>
-              <w:left w:w="120" w:type="dxa"/>
-              <w:bottom w:w="120" w:type="dxa"/>
-              <w:right w:w="120" w:type="dxa"/>
-            </w:tcMar>
-            <w:vAlign w:val="center"/>
-          </w:tcPr>
-          <w:p>
-            <w:pPr>
-              <w:jc w:val="center"/>
-            </w:pPr>
-            <w:r>
-              <w:rPr>
-                <w:b/>
-              </w:rPr>
-              <w:t>用途说明</w:t>
-            </w:r>
-          </w:p>
-        </w:tc>
-      </w:tr>
-      <w:tr>
-        <w:trPr>
-          <w:jc w:val="center"/>
-        </w:trPr>
-        <w:tc>
-          <w:tcPr>
-            <w:tcW w:w="2268" w:type="dxa"/>
-            <w:tcMar>
-              <w:top w:w="120" w:type="dxa"/>
-              <w:left w:w="120" w:type="dxa"/>
-              <w:bottom w:w="120" w:type="dxa"/>
-              <w:right w:w="120" w:type="dxa"/>
-            </w:tcMar>
-            <w:vAlign w:val="center"/>
-          </w:tcPr>
-          <w:p>
-            <w:pPr>
-              <w:jc w:val="center"/>
-            </w:pPr>
-            <w:r>
-              <w:rPr>
-                <w:sz w:val="20"/>
-              </w:rPr>
-              <w:t>projects</w:t>
-            </w:r>
-          </w:p>
-        </w:tc>
-        <w:tc>
-          <w:tcPr>
-            <w:tcW w:w="2381" w:type="dxa"/>
-            <w:tcMar>
-              <w:top w:w="120" w:type="dxa"/>
-              <w:left w:w="120" w:type="dxa"/>
-              <w:bottom w:w="120" w:type="dxa"/>
-              <w:right w:w="120" w:type="dxa"/>
-            </w:tcMar>
-            <w:vAlign w:val="center"/>
-          </w:tcPr>
-          <w:p>
-            <w:pPr>
-              <w:jc w:val="center"/>
-            </w:pPr>
-            <w:r>
-              <w:rPr>
-                <w:sz w:val="20"/>
-              </w:rPr>
-              <w:t>项目总目录</w:t>
-            </w:r>
-          </w:p>
-        </w:tc>
-        <w:tc>
-          <w:tcPr>
-            <w:tcW w:w="4706" w:type="dxa"/>
-            <w:tcMar>
-              <w:top w:w="120" w:type="dxa"/>
-              <w:left w:w="120" w:type="dxa"/>
-              <w:bottom w:w="120" w:type="dxa"/>
-              <w:right w:w="120" w:type="dxa"/>
-            </w:tcMar>
-            <w:vAlign w:val="center"/>
-          </w:tcPr>
-          <w:p>
-            <w:pPr>
-              <w:rPr>
-                <w:lang w:eastAsia="zh-CN"/>
-              </w:rPr>
-            </w:pPr>
-            <w:r>
-              <w:rPr>
-                <w:sz w:val="20"/>
-                <w:lang w:eastAsia="zh-CN"/>
-              </w:rPr>
-              <w:t>所有正式工程的统一入口</w:t>
-            </w:r>
-          </w:p>
-        </w:tc>
-      </w:tr>
-      <w:tr>
-        <w:trPr>
-          <w:jc w:val="center"/>
-        </w:trPr>
-        <w:tc>
-          <w:tcPr>
-            <w:tcW w:w="2268" w:type="dxa"/>
-            <w:tcMar>
-              <w:top w:w="120" w:type="dxa"/>
-              <w:left w:w="120" w:type="dxa"/>
-              <w:bottom w:w="120" w:type="dxa"/>
-              <w:right w:w="120" w:type="dxa"/>
-            </w:tcMar>
-            <w:vAlign w:val="center"/>
-          </w:tcPr>
-          <w:p>
-            <w:pPr>
-              <w:jc w:val="center"/>
-            </w:pPr>
-            <w:proofErr w:type="spellStart"/>
-            <w:r>
-              <w:rPr>
-                <w:sz w:val="20"/>
-              </w:rPr>
-              <w:lastRenderedPageBreak/>
-              <w:t>uav_stack</w:t>
-            </w:r>
-            <w:proofErr w:type="spellEnd"/>
-          </w:p>
-        </w:tc>
-        <w:tc>
-          <w:tcPr>
-            <w:tcW w:w="2381" w:type="dxa"/>
-            <w:tcMar>
-              <w:top w:w="120" w:type="dxa"/>
-              <w:left w:w="120" w:type="dxa"/>
-              <w:bottom w:w="120" w:type="dxa"/>
-              <w:right w:w="120" w:type="dxa"/>
-            </w:tcMar>
-            <w:vAlign w:val="center"/>
-          </w:tcPr>
-          <w:p>
-            <w:pPr>
-              <w:jc w:val="center"/>
-            </w:pPr>
-            <w:r>
-              <w:rPr>
-                <w:sz w:val="20"/>
-              </w:rPr>
-              <w:t>无人机总工程</w:t>
-            </w:r>
-          </w:p>
-        </w:tc>
-        <w:tc>
-          <w:tcPr>
-            <w:tcW w:w="4706" w:type="dxa"/>
-            <w:tcMar>
-              <w:top w:w="120" w:type="dxa"/>
-              <w:left w:w="120" w:type="dxa"/>
-              <w:bottom w:w="120" w:type="dxa"/>
-              <w:right w:w="120" w:type="dxa"/>
-            </w:tcMar>
-            <w:vAlign w:val="center"/>
-          </w:tcPr>
-          <w:p>
-            <w:pPr>
-              <w:rPr>
-                <w:lang w:eastAsia="zh-CN"/>
-              </w:rPr>
-            </w:pPr>
-            <w:r>
-              <w:rPr>
-                <w:sz w:val="20"/>
-                <w:lang w:eastAsia="zh-CN"/>
-              </w:rPr>
-              <w:t>本机载环境的主工程目录</w:t>
-            </w:r>
-          </w:p>
-        </w:tc>
-      </w:tr>
-      <w:tr>
-        <w:trPr>
-          <w:jc w:val="center"/>
-        </w:trPr>
-        <w:tc>
-          <w:tcPr>
-            <w:tcW w:w="2268" w:type="dxa"/>
-            <w:tcMar>
-              <w:top w:w="120" w:type="dxa"/>
-              <w:left w:w="120" w:type="dxa"/>
-              <w:bottom w:w="120" w:type="dxa"/>
-              <w:right w:w="120" w:type="dxa"/>
-            </w:tcMar>
-            <w:vAlign w:val="center"/>
-          </w:tcPr>
-          <w:p>
-            <w:pPr>
-              <w:jc w:val="center"/>
-            </w:pPr>
-            <w:proofErr w:type="spellStart"/>
-            <w:r>
-              <w:rPr>
-                <w:sz w:val="20"/>
-              </w:rPr>
-              <w:t>catkin_ws</w:t>
-            </w:r>
-            <w:proofErr w:type="spellEnd"/>
-          </w:p>
-        </w:tc>
-        <w:tc>
-          <w:tcPr>
-            <w:tcW w:w="2381" w:type="dxa"/>
-            <w:tcMar>
-              <w:top w:w="120" w:type="dxa"/>
-              <w:left w:w="120" w:type="dxa"/>
-              <w:bottom w:w="120" w:type="dxa"/>
-              <w:right w:w="120" w:type="dxa"/>
-            </w:tcMar>
-            <w:vAlign w:val="center"/>
-          </w:tcPr>
-          <w:p>
-            <w:pPr>
-              <w:jc w:val="center"/>
-            </w:pPr>
-            <w:r>
-              <w:rPr>
-                <w:sz w:val="20"/>
-              </w:rPr>
-              <w:t>ROS 工作空间</w:t>
-            </w:r>
-          </w:p>
-        </w:tc>
-        <w:tc>
-          <w:tcPr>
-            <w:tcW w:w="4706" w:type="dxa"/>
-            <w:tcMar>
-              <w:top w:w="120" w:type="dxa"/>
-              <w:left w:w="120" w:type="dxa"/>
-              <w:bottom w:w="120" w:type="dxa"/>
-              <w:right w:w="120" w:type="dxa"/>
-            </w:tcMar>
-            <w:vAlign w:val="center"/>
-          </w:tcPr>
-          <w:p>
-            <w:r>
-              <w:rPr>
-                <w:sz w:val="20"/>
-              </w:rPr>
-              <w:t>放 ROS 包和 catkin 编译产物</w:t>
-            </w:r>
-          </w:p>
-        </w:tc>
-      </w:tr>
-      <w:tr>
-        <w:trPr>
-          <w:jc w:val="center"/>
-        </w:trPr>
-        <w:tc>
-          <w:tcPr>
-            <w:tcW w:w="2268" w:type="dxa"/>
-            <w:tcMar>
-              <w:top w:w="120" w:type="dxa"/>
-              <w:left w:w="120" w:type="dxa"/>
-              <w:bottom w:w="120" w:type="dxa"/>
-              <w:right w:w="120" w:type="dxa"/>
-            </w:tcMar>
-            <w:vAlign w:val="center"/>
-          </w:tcPr>
-          <w:p>
-            <w:pPr>
-              <w:jc w:val="center"/>
-            </w:pPr>
-            <w:r>
-              <w:rPr>
-                <w:sz w:val="20"/>
-              </w:rPr>
-              <w:t>src</w:t>
-            </w:r>
-          </w:p>
-        </w:tc>
-        <w:tc>
-          <w:tcPr>
-            <w:tcW w:w="2381" w:type="dxa"/>
-            <w:tcMar>
-              <w:top w:w="120" w:type="dxa"/>
-              <w:left w:w="120" w:type="dxa"/>
-              <w:bottom w:w="120" w:type="dxa"/>
-              <w:right w:w="120" w:type="dxa"/>
-            </w:tcMar>
-            <w:vAlign w:val="center"/>
-          </w:tcPr>
-          <w:p>
-            <w:pPr>
-              <w:jc w:val="center"/>
-            </w:pPr>
-            <w:r>
-              <w:rPr>
-                <w:sz w:val="20"/>
-              </w:rPr>
-              <w:t>源码目录</w:t>
-            </w:r>
-          </w:p>
-        </w:tc>
-        <w:tc>
-          <w:tcPr>
-            <w:tcW w:w="4706" w:type="dxa"/>
-            <w:tcMar>
-              <w:top w:w="120" w:type="dxa"/>
-              <w:left w:w="120" w:type="dxa"/>
-              <w:bottom w:w="120" w:type="dxa"/>
-              <w:right w:w="120" w:type="dxa"/>
-            </w:tcMar>
-            <w:vAlign w:val="center"/>
-          </w:tcPr>
-          <w:p>
-            <w:r>
-              <w:rPr>
-                <w:sz w:val="20"/>
-              </w:rPr>
-              <w:t>ROS 包源码</w:t>
-            </w:r>
-          </w:p>
-        </w:tc>
-      </w:tr>
-      <w:tr>
-        <w:trPr>
-          <w:jc w:val="center"/>
-        </w:trPr>
-        <w:tc>
-          <w:tcPr>
-            <w:tcW w:w="2268" w:type="dxa"/>
-            <w:tcMar>
-              <w:top w:w="120" w:type="dxa"/>
-              <w:left w:w="120" w:type="dxa"/>
-              <w:bottom w:w="120" w:type="dxa"/>
-              <w:right w:w="120" w:type="dxa"/>
-            </w:tcMar>
-            <w:vAlign w:val="center"/>
-          </w:tcPr>
-          <w:p>
-            <w:pPr>
-              <w:jc w:val="center"/>
-            </w:pPr>
-            <w:r>
-              <w:rPr>
-                <w:sz w:val="20"/>
-              </w:rPr>
-              <w:t>build</w:t>
-            </w:r>
-          </w:p>
-        </w:tc>
-        <w:tc>
-          <w:tcPr>
-            <w:tcW w:w="2381" w:type="dxa"/>
-            <w:tcMar>
-              <w:top w:w="120" w:type="dxa"/>
-              <w:left w:w="120" w:type="dxa"/>
-              <w:bottom w:w="120" w:type="dxa"/>
-              <w:right w:w="120" w:type="dxa"/>
-            </w:tcMar>
-            <w:vAlign w:val="center"/>
-          </w:tcPr>
-          <w:p>
-            <w:pPr>
-              <w:jc w:val="center"/>
-            </w:pPr>
-            <w:r>
-              <w:rPr>
-                <w:sz w:val="20"/>
-              </w:rPr>
-              <w:t>构建目录</w:t>
-            </w:r>
-          </w:p>
-        </w:tc>
-        <w:tc>
-          <w:tcPr>
-            <w:tcW w:w="4706" w:type="dxa"/>
-            <w:tcMar>
-              <w:top w:w="120" w:type="dxa"/>
-              <w:left w:w="120" w:type="dxa"/>
-              <w:bottom w:w="120" w:type="dxa"/>
-              <w:right w:w="120" w:type="dxa"/>
-            </w:tcMar>
-            <w:vAlign w:val="center"/>
-          </w:tcPr>
-          <w:p>
-            <w:r>
-              <w:rPr>
-                <w:sz w:val="20"/>
-              </w:rPr>
-              <w:t>编译中间文件</w:t>
-            </w:r>
-          </w:p>
-        </w:tc>
-      </w:tr>
-      <w:tr>
-        <w:trPr>
-          <w:jc w:val="center"/>
-        </w:trPr>
-        <w:tc>
-          <w:tcPr>
-            <w:tcW w:w="2268" w:type="dxa"/>
-            <w:tcMar>
-              <w:top w:w="120" w:type="dxa"/>
-              <w:left w:w="120" w:type="dxa"/>
-              <w:bottom w:w="120" w:type="dxa"/>
-              <w:right w:w="120" w:type="dxa"/>
-            </w:tcMar>
-            <w:vAlign w:val="center"/>
-          </w:tcPr>
-          <w:p>
-            <w:pPr>
-              <w:jc w:val="center"/>
-            </w:pPr>
-            <w:r>
-              <w:rPr>
-                <w:sz w:val="20"/>
-              </w:rPr>
-              <w:t>devel</w:t>
-            </w:r>
-          </w:p>
-        </w:tc>
-        <w:tc>
-          <w:tcPr>
-            <w:tcW w:w="2381" w:type="dxa"/>
-            <w:tcMar>
-              <w:top w:w="120" w:type="dxa"/>
-              <w:left w:w="120" w:type="dxa"/>
-              <w:bottom w:w="120" w:type="dxa"/>
-              <w:right w:w="120" w:type="dxa"/>
-            </w:tcMar>
-            <w:vAlign w:val="center"/>
-          </w:tcPr>
-          <w:p>
-            <w:pPr>
-              <w:jc w:val="center"/>
-            </w:pPr>
-            <w:r>
-              <w:rPr>
-                <w:sz w:val="20"/>
-              </w:rPr>
-              <w:t>开发环境目录</w:t>
-            </w:r>
-          </w:p>
-        </w:tc>
-        <w:tc>
-          <w:tcPr>
-            <w:tcW w:w="4706" w:type="dxa"/>
-            <w:tcMar>
-              <w:top w:w="120" w:type="dxa"/>
-              <w:left w:w="120" w:type="dxa"/>
-              <w:bottom w:w="120" w:type="dxa"/>
-              <w:right w:w="120" w:type="dxa"/>
-            </w:tcMar>
-            <w:vAlign w:val="center"/>
-          </w:tcPr>
-          <w:p>
-            <w:r>
-              <w:rPr>
-                <w:sz w:val="20"/>
-              </w:rPr>
-              <w:t>catkin 生成环境与产物</w:t>
-            </w:r>
-          </w:p>
-        </w:tc>
-      </w:tr>
-      <w:tr>
-        <w:trPr>
-          <w:jc w:val="center"/>
-        </w:trPr>
-        <w:tc>
-          <w:tcPr>
-            <w:tcW w:w="2268" w:type="dxa"/>
-            <w:tcMar>
-              <w:top w:w="120" w:type="dxa"/>
-              <w:left w:w="120" w:type="dxa"/>
-              <w:bottom w:w="120" w:type="dxa"/>
-              <w:right w:w="120" w:type="dxa"/>
-            </w:tcMar>
-            <w:vAlign w:val="center"/>
-          </w:tcPr>
-          <w:p>
-            <w:pPr>
-              <w:jc w:val="center"/>
-            </w:pPr>
-            <w:r>
-              <w:rPr>
-                <w:sz w:val="20"/>
-              </w:rPr>
-              <w:t>third_party</w:t>
-            </w:r>
-          </w:p>
-        </w:tc>
-        <w:tc>
-          <w:tcPr>
-            <w:tcW w:w="2381" w:type="dxa"/>
-            <w:tcMar>
-              <w:top w:w="120" w:type="dxa"/>
-              <w:left w:w="120" w:type="dxa"/>
-              <w:bottom w:w="120" w:type="dxa"/>
-              <w:right w:w="120" w:type="dxa"/>
-            </w:tcMar>
-            <w:vAlign w:val="center"/>
-          </w:tcPr>
-          <w:p>
-            <w:pPr>
-              <w:jc w:val="center"/>
-            </w:pPr>
-            <w:r>
-              <w:rPr>
-                <w:sz w:val="20"/>
-              </w:rPr>
-              <w:t>第三方源码目录</w:t>
-            </w:r>
-          </w:p>
-        </w:tc>
-        <w:tc>
-          <w:tcPr>
-            <w:tcW w:w="4706" w:type="dxa"/>
-            <w:tcMar>
-              <w:top w:w="120" w:type="dxa"/>
-              <w:left w:w="120" w:type="dxa"/>
-              <w:bottom w:w="120" w:type="dxa"/>
-              <w:right w:w="120" w:type="dxa"/>
-            </w:tcMar>
-            <w:vAlign w:val="center"/>
-          </w:tcPr>
-          <w:p>
-            <w:pPr>
-              <w:rPr>
-                <w:lang w:eastAsia="zh-CN"/>
-              </w:rPr>
-            </w:pPr>
-            <w:r>
-              <w:rPr>
-                <w:sz w:val="20"/>
-                <w:lang w:eastAsia="zh-CN"/>
-              </w:rPr>
-              <w:t>非 ROS 外部依赖源码</w:t>
-            </w:r>
-          </w:p>
-        </w:tc>
-      </w:tr>
-      <w:tr>
-        <w:trPr>
-          <w:jc w:val="center"/>
-        </w:trPr>
-        <w:tc>
-          <w:tcPr>
-            <w:tcW w:w="2268" w:type="dxa"/>
-            <w:tcMar>
-              <w:top w:w="120" w:type="dxa"/>
-              <w:left w:w="120" w:type="dxa"/>
-              <w:bottom w:w="120" w:type="dxa"/>
-              <w:right w:w="120" w:type="dxa"/>
-            </w:tcMar>
-            <w:vAlign w:val="center"/>
-          </w:tcPr>
-          <w:p>
-            <w:pPr>
-              <w:jc w:val="center"/>
-            </w:pPr>
-            <w:r>
-              <w:rPr>
-                <w:sz w:val="20"/>
-              </w:rPr>
-              <w:t>models</w:t>
-            </w:r>
-          </w:p>
-        </w:tc>
-        <w:tc>
-          <w:tcPr>
-            <w:tcW w:w="2381" w:type="dxa"/>
-            <w:tcMar>
-              <w:top w:w="120" w:type="dxa"/>
-              <w:left w:w="120" w:type="dxa"/>
-              <w:bottom w:w="120" w:type="dxa"/>
-              <w:right w:w="120" w:type="dxa"/>
-            </w:tcMar>
-            <w:vAlign w:val="center"/>
-          </w:tcPr>
-          <w:p>
-            <w:pPr>
-              <w:jc w:val="center"/>
-            </w:pPr>
-            <w:r>
-              <w:rPr>
-                <w:sz w:val="20"/>
-              </w:rPr>
-              <w:t>模型目录</w:t>
-            </w:r>
-          </w:p>
-        </w:tc>
-        <w:tc>
-          <w:tcPr>
-            <w:tcW w:w="4706" w:type="dxa"/>
-            <w:tcMar>
-              <w:top w:w="120" w:type="dxa"/>
-              <w:left w:w="120" w:type="dxa"/>
-              <w:bottom w:w="120" w:type="dxa"/>
-              <w:right w:w="120" w:type="dxa"/>
-            </w:tcMar>
-            <w:vAlign w:val="center"/>
-          </w:tcPr>
-          <w:p>
-            <w:pPr>
-              <w:rPr>
-                <w:lang w:eastAsia="zh-CN"/>
-              </w:rPr>
-            </w:pPr>
-            <w:r>
-              <w:rPr>
-                <w:sz w:val="20"/>
-                <w:lang w:eastAsia="zh-CN"/>
-              </w:rPr>
-              <w:t>权重、导出模型、备份模型</w:t>
-            </w:r>
-          </w:p>
-        </w:tc>
-      </w:tr>
-      <w:tr>
-        <w:trPr>
-          <w:jc w:val="center"/>
-        </w:trPr>
-        <w:tc>
-          <w:tcPr>
-            <w:tcW w:w="2268" w:type="dxa"/>
-            <w:tcMar>
-              <w:top w:w="120" w:type="dxa"/>
-              <w:left w:w="120" w:type="dxa"/>
-              <w:bottom w:w="120" w:type="dxa"/>
-              <w:right w:w="120" w:type="dxa"/>
-            </w:tcMar>
-            <w:vAlign w:val="center"/>
-          </w:tcPr>
-          <w:p>
-            <w:pPr>
-              <w:jc w:val="center"/>
-            </w:pPr>
-            <w:r>
-              <w:rPr>
-                <w:sz w:val="20"/>
-              </w:rPr>
-              <w:t>backup</w:t>
-            </w:r>
-          </w:p>
-        </w:tc>
-        <w:tc>
-          <w:tcPr>
-            <w:tcW w:w="2381" w:type="dxa"/>
-            <w:tcMar>
-              <w:top w:w="120" w:type="dxa"/>
-              <w:left w:w="120" w:type="dxa"/>
-              <w:bottom w:w="120" w:type="dxa"/>
-              <w:right w:w="120" w:type="dxa"/>
-            </w:tcMar>
-            <w:vAlign w:val="center"/>
-          </w:tcPr>
-          <w:p>
-            <w:pPr>
-              <w:jc w:val="center"/>
-            </w:pPr>
-            <w:r>
-              <w:rPr>
-                <w:sz w:val="20"/>
-              </w:rPr>
-              <w:t>备份目录</w:t>
-            </w:r>
-          </w:p>
-        </w:tc>
-        <w:tc>
-          <w:tcPr>
-            <w:tcW w:w="4706" w:type="dxa"/>
-            <w:tcMar>
-              <w:top w:w="120" w:type="dxa"/>
-              <w:left w:w="120" w:type="dxa"/>
-              <w:bottom w:w="120" w:type="dxa"/>
-              <w:right w:w="120" w:type="dxa"/>
-            </w:tcMar>
-            <w:vAlign w:val="center"/>
-          </w:tcPr>
-          <w:p>
-            <w:r>
-              <w:rPr>
-                <w:sz w:val="20"/>
-              </w:rPr>
-              <w:t>旧模型或可回滚版本</w:t>
-            </w:r>
-          </w:p>
-        </w:tc>
-      </w:tr>
-      <w:tr>
-        <w:trPr>
-          <w:jc w:val="center"/>
-        </w:trPr>
-        <w:tc>
-          <w:tcPr>
-            <w:tcW w:w="2268" w:type="dxa"/>
-            <w:tcMar>
-              <w:top w:w="120" w:type="dxa"/>
-              <w:left w:w="120" w:type="dxa"/>
-              <w:bottom w:w="120" w:type="dxa"/>
-              <w:right w:w="120" w:type="dxa"/>
-            </w:tcMar>
-            <w:vAlign w:val="center"/>
-          </w:tcPr>
-          <w:p>
-            <w:pPr>
-              <w:jc w:val="center"/>
-            </w:pPr>
-            <w:r>
-              <w:rPr>
-                <w:sz w:val="20"/>
-              </w:rPr>
-              <w:t>config</w:t>
-            </w:r>
-          </w:p>
-        </w:tc>
-        <w:tc>
-          <w:tcPr>
-            <w:tcW w:w="2381" w:type="dxa"/>
-            <w:tcMar>
-              <w:top w:w="120" w:type="dxa"/>
-              <w:left w:w="120" w:type="dxa"/>
-              <w:bottom w:w="120" w:type="dxa"/>
-              <w:right w:w="120" w:type="dxa"/>
-            </w:tcMar>
-            <w:vAlign w:val="center"/>
-          </w:tcPr>
-          <w:p>
-            <w:pPr>
-              <w:jc w:val="center"/>
-            </w:pPr>
-            <w:r>
-              <w:rPr>
-                <w:sz w:val="20"/>
-              </w:rPr>
-              <w:t>配置目录</w:t>
-            </w:r>
-          </w:p>
-        </w:tc>
-        <w:tc>
-          <w:tcPr>
-            <w:tcW w:w="4706" w:type="dxa"/>
-            <w:tcMar>
-              <w:top w:w="120" w:type="dxa"/>
-              <w:left w:w="120" w:type="dxa"/>
-              <w:bottom w:w="120" w:type="dxa"/>
-              <w:right w:w="120" w:type="dxa"/>
-            </w:tcMar>
-            <w:vAlign w:val="center"/>
-          </w:tcPr>
-          <w:p>
-            <w:pPr>
-              <w:rPr>
-                <w:lang w:eastAsia="zh-CN"/>
-              </w:rPr>
-            </w:pPr>
-            <w:r>
-              <w:rPr>
-                <w:sz w:val="20"/>
-                <w:lang w:eastAsia="zh-CN"/>
-              </w:rPr>
-              <w:t>参数、</w:t>
-            </w:r>
-            <w:proofErr w:type="spellStart"/>
-            <w:r>
-              <w:rPr>
-                <w:sz w:val="20"/>
-                <w:lang w:eastAsia="zh-CN"/>
-              </w:rPr>
-              <w:t>yaml</w:t>
-            </w:r>
-            <w:proofErr w:type="spellEnd"/>
-            <w:r>
-              <w:rPr>
-                <w:sz w:val="20"/>
-                <w:lang w:eastAsia="zh-CN"/>
-              </w:rPr>
-              <w:t>、launch、记录文件</w:t>
-            </w:r>
-          </w:p>
-        </w:tc>
-      </w:tr>
-      <w:tr>
-        <w:trPr>
-          <w:jc w:val="center"/>
-        </w:trPr>
-        <w:tc>
-          <w:tcPr>
-            <w:tcW w:w="2268" w:type="dxa"/>
-            <w:tcMar>
-              <w:top w:w="120" w:type="dxa"/>
-              <w:left w:w="120" w:type="dxa"/>
-              <w:bottom w:w="120" w:type="dxa"/>
-              <w:right w:w="120" w:type="dxa"/>
-            </w:tcMar>
-            <w:vAlign w:val="center"/>
-          </w:tcPr>
-          <w:p>
-            <w:pPr>
-              <w:jc w:val="center"/>
-            </w:pPr>
-            <w:r>
-              <w:rPr>
-                <w:sz w:val="20"/>
-              </w:rPr>
-              <w:t>scripts</w:t>
-            </w:r>
-          </w:p>
-        </w:tc>
-        <w:tc>
-          <w:tcPr>
-            <w:tcW w:w="2381" w:type="dxa"/>
-            <w:tcMar>
-              <w:top w:w="120" w:type="dxa"/>
-              <w:left w:w="120" w:type="dxa"/>
-              <w:bottom w:w="120" w:type="dxa"/>
-              <w:right w:w="120" w:type="dxa"/>
-            </w:tcMar>
-            <w:vAlign w:val="center"/>
-          </w:tcPr>
-          <w:p>
-            <w:pPr>
-              <w:jc w:val="center"/>
-            </w:pPr>
-            <w:r>
-              <w:rPr>
-                <w:sz w:val="20"/>
-              </w:rPr>
-              <w:t>脚本目录</w:t>
-            </w:r>
-          </w:p>
-        </w:tc>
-        <w:tc>
-          <w:tcPr>
-            <w:tcW w:w="4706" w:type="dxa"/>
-            <w:tcMar>
-              <w:top w:w="120" w:type="dxa"/>
-              <w:left w:w="120" w:type="dxa"/>
-              <w:bottom w:w="120" w:type="dxa"/>
-              <w:right w:w="120" w:type="dxa"/>
-            </w:tcMar>
-            <w:vAlign w:val="center"/>
-          </w:tcPr>
-          <w:p>
-            <w:pPr>
-              <w:rPr>
-                <w:lang w:eastAsia="zh-CN"/>
-              </w:rPr>
-            </w:pPr>
-            <w:r>
-              <w:rPr>
-                <w:sz w:val="20"/>
-                <w:lang w:eastAsia="zh-CN"/>
-              </w:rPr>
-              <w:t>启动、录包、检查、辅助脚本</w:t>
-            </w:r>
-          </w:p>
-        </w:tc>
-      </w:tr>
-      <w:tr>
-        <w:trPr>
-          <w:jc w:val="center"/>
-        </w:trPr>
-        <w:tc>
-          <w:tcPr>
-            <w:tcW w:w="2268" w:type="dxa"/>
-            <w:tcMar>
-              <w:top w:w="120" w:type="dxa"/>
-              <w:left w:w="120" w:type="dxa"/>
-              <w:bottom w:w="120" w:type="dxa"/>
-              <w:right w:w="120" w:type="dxa"/>
-            </w:tcMar>
-            <w:vAlign w:val="center"/>
-          </w:tcPr>
-          <w:p>
-            <w:pPr>
-              <w:jc w:val="center"/>
-            </w:pPr>
-            <w:r>
-              <w:rPr>
-                <w:sz w:val="20"/>
-              </w:rPr>
-              <w:t>data</w:t>
-            </w:r>
-          </w:p>
-        </w:tc>
-        <w:tc>
-          <w:tcPr>
-            <w:tcW w:w="2381" w:type="dxa"/>
-            <w:tcMar>
-              <w:top w:w="120" w:type="dxa"/>
-              <w:left w:w="120" w:type="dxa"/>
-              <w:bottom w:w="120" w:type="dxa"/>
-              <w:right w:w="120" w:type="dxa"/>
-            </w:tcMar>
-            <w:vAlign w:val="center"/>
-          </w:tcPr>
-          <w:p>
-            <w:pPr>
-              <w:jc w:val="center"/>
-            </w:pPr>
-            <w:r>
-              <w:rPr>
-                <w:sz w:val="20"/>
-              </w:rPr>
-              <w:t>数据目录</w:t>
-            </w:r>
-          </w:p>
-        </w:tc>
-        <w:tc>
-          <w:tcPr>
-            <w:tcW w:w="4706" w:type="dxa"/>
-            <w:tcMar>
-              <w:top w:w="120" w:type="dxa"/>
-              <w:left w:w="120" w:type="dxa"/>
-              <w:bottom w:w="120" w:type="dxa"/>
-              <w:right w:w="120" w:type="dxa"/>
-            </w:tcMar>
-            <w:vAlign w:val="center"/>
-          </w:tcPr>
-          <w:p>
-            <w:pPr>
-              <w:rPr>
-                <w:lang w:eastAsia="zh-CN"/>
-              </w:rPr>
-            </w:pPr>
-            <w:proofErr w:type="spellStart"/>
-            <w:r>
-              <w:rPr>
-                <w:sz w:val="20"/>
-                <w:lang w:eastAsia="zh-CN"/>
-              </w:rPr>
-              <w:t>rosbag</w:t>
-            </w:r>
-            <w:proofErr w:type="spellEnd"/>
-            <w:r>
-              <w:rPr>
-                <w:sz w:val="20"/>
-                <w:lang w:eastAsia="zh-CN"/>
-              </w:rPr>
-              <w:t>、标定、数据集、结果、视频</w:t>
-            </w:r>
-          </w:p>
-        </w:tc>
-      </w:tr>
-      <w:tr>
-        <w:trPr>
-          <w:jc w:val="center"/>
-        </w:trPr>
-        <w:tc>
-          <w:tcPr>
-            <w:tcW w:w="2268" w:type="dxa"/>
-            <w:tcMar>
-              <w:top w:w="120" w:type="dxa"/>
-              <w:left w:w="120" w:type="dxa"/>
-              <w:bottom w:w="120" w:type="dxa"/>
-              <w:right w:w="120" w:type="dxa"/>
-            </w:tcMar>
-            <w:vAlign w:val="center"/>
-          </w:tcPr>
-          <w:p>
-            <w:pPr>
-              <w:jc w:val="center"/>
-            </w:pPr>
-            <w:proofErr w:type="spellStart"/>
-            <w:r>
-              <w:rPr>
-                <w:sz w:val="20"/>
-              </w:rPr>
-              <w:t>rosbag</w:t>
-            </w:r>
-            <w:proofErr w:type="spellEnd"/>
-          </w:p>
-        </w:tc>
-        <w:tc>
-          <w:tcPr>
-            <w:tcW w:w="2381" w:type="dxa"/>
-            <w:tcMar>
-              <w:top w:w="120" w:type="dxa"/>
-              <w:left w:w="120" w:type="dxa"/>
-              <w:bottom w:w="120" w:type="dxa"/>
-              <w:right w:w="120" w:type="dxa"/>
-            </w:tcMar>
-            <w:vAlign w:val="center"/>
-          </w:tcPr>
-          <w:p>
-            <w:pPr>
-              <w:jc w:val="center"/>
-            </w:pPr>
-            <w:r>
-              <w:rPr>
-                <w:sz w:val="20"/>
-              </w:rPr>
-              <w:t>录包目录</w:t>
-            </w:r>
-          </w:p>
-        </w:tc>
-        <w:tc>
-          <w:tcPr>
-            <w:tcW w:w="4706" w:type="dxa"/>
-            <w:tcMar>
-              <w:top w:w="120" w:type="dxa"/>
-              <w:left w:w="120" w:type="dxa"/>
-              <w:bottom w:w="120" w:type="dxa"/>
-              <w:right w:w="120" w:type="dxa"/>
-            </w:tcMar>
-            <w:vAlign w:val="center"/>
-          </w:tcPr>
-          <w:p>
-            <w:r>
-              <w:rPr>
-                <w:sz w:val="20"/>
-              </w:rPr>
-              <w:t>保存 rosbag 文件</w:t>
-            </w:r>
-          </w:p>
-        </w:tc>
-      </w:tr>
-      <w:tr>
-        <w:trPr>
-          <w:jc w:val="center"/>
-        </w:trPr>
-        <w:tc>
-          <w:tcPr>
-            <w:tcW w:w="2268" w:type="dxa"/>
-            <w:tcMar>
-              <w:top w:w="120" w:type="dxa"/>
-              <w:left w:w="120" w:type="dxa"/>
-              <w:bottom w:w="120" w:type="dxa"/>
-              <w:right w:w="120" w:type="dxa"/>
-            </w:tcMar>
-            <w:vAlign w:val="center"/>
-          </w:tcPr>
-          <w:p>
-            <w:pPr>
-              <w:jc w:val="center"/>
-            </w:pPr>
-            <w:r>
-              <w:rPr>
-                <w:sz w:val="20"/>
-              </w:rPr>
-              <w:t>calibration</w:t>
-            </w:r>
-          </w:p>
-        </w:tc>
-        <w:tc>
-          <w:tcPr>
-            <w:tcW w:w="2381" w:type="dxa"/>
-            <w:tcMar>
-              <w:top w:w="120" w:type="dxa"/>
-              <w:left w:w="120" w:type="dxa"/>
-              <w:bottom w:w="120" w:type="dxa"/>
-              <w:right w:w="120" w:type="dxa"/>
-            </w:tcMar>
-            <w:vAlign w:val="center"/>
-          </w:tcPr>
-          <w:p>
-            <w:pPr>
-              <w:jc w:val="center"/>
-            </w:pPr>
-            <w:r>
-              <w:rPr>
-                <w:sz w:val="20"/>
-              </w:rPr>
-              <w:t>标定目录</w:t>
-            </w:r>
-          </w:p>
-        </w:tc>
-        <w:tc>
-          <w:tcPr>
-            <w:tcW w:w="4706" w:type="dxa"/>
-            <w:tcMar>
-              <w:top w:w="120" w:type="dxa"/>
-              <w:left w:w="120" w:type="dxa"/>
-              <w:bottom w:w="120" w:type="dxa"/>
-              <w:right w:w="120" w:type="dxa"/>
-            </w:tcMar>
-            <w:vAlign w:val="center"/>
-          </w:tcPr>
-          <w:p>
-            <w:pPr>
-              <w:rPr>
-                <w:lang w:eastAsia="zh-CN"/>
-              </w:rPr>
-            </w:pPr>
-            <w:r>
-              <w:rPr>
-                <w:sz w:val="20"/>
-                <w:lang w:eastAsia="zh-CN"/>
-              </w:rPr>
-              <w:t>相机/IMU/外参标定文件</w:t>
-            </w:r>
-          </w:p>
-        </w:tc>
-      </w:tr>
-      <w:tr>
-        <w:trPr>
-          <w:jc w:val="center"/>
-        </w:trPr>
-        <w:tc>
-          <w:tcPr>
-            <w:tcW w:w="2268" w:type="dxa"/>
-            <w:tcMar>
-              <w:top w:w="120" w:type="dxa"/>
-              <w:left w:w="120" w:type="dxa"/>
-              <w:bottom w:w="120" w:type="dxa"/>
-              <w:right w:w="120" w:type="dxa"/>
-            </w:tcMar>
-            <w:vAlign w:val="center"/>
-          </w:tcPr>
-          <w:p>
-            <w:pPr>
-              <w:jc w:val="center"/>
-            </w:pPr>
-            <w:r>
-              <w:rPr>
-                <w:sz w:val="20"/>
-              </w:rPr>
-              <w:t>dataset</w:t>
-            </w:r>
-          </w:p>
-        </w:tc>
-        <w:tc>
-          <w:tcPr>
-            <w:tcW w:w="2381" w:type="dxa"/>
-            <w:tcMar>
-              <w:top w:w="120" w:type="dxa"/>
-              <w:left w:w="120" w:type="dxa"/>
-              <w:bottom w:w="120" w:type="dxa"/>
-              <w:right w:w="120" w:type="dxa"/>
-            </w:tcMar>
-            <w:vAlign w:val="center"/>
-          </w:tcPr>
-          <w:p>
-            <w:pPr>
-              <w:jc w:val="center"/>
-            </w:pPr>
-            <w:r>
-              <w:rPr>
-                <w:sz w:val="20"/>
-              </w:rPr>
-              <w:t>数据集目录</w:t>
-            </w:r>
-          </w:p>
-        </w:tc>
-        <w:tc>
-          <w:tcPr>
-            <w:tcW w:w="4706" w:type="dxa"/>
-            <w:tcMar>
-              <w:top w:w="120" w:type="dxa"/>
-              <w:left w:w="120" w:type="dxa"/>
-              <w:bottom w:w="120" w:type="dxa"/>
-              <w:right w:w="120" w:type="dxa"/>
-            </w:tcMar>
-            <w:vAlign w:val="center"/>
-          </w:tcPr>
-          <w:p>
-            <w:r>
-              <w:rPr>
-                <w:sz w:val="20"/>
-              </w:rPr>
-              <w:t>公开数据集或训练集</w:t>
-            </w:r>
-          </w:p>
-        </w:tc>
-      </w:tr>
-      <w:tr>
-        <w:trPr>
-          <w:jc w:val="center"/>
-        </w:trPr>
-        <w:tc>
-          <w:tcPr>
-            <w:tcW w:w="2268" w:type="dxa"/>
-            <w:tcMar>
-              <w:top w:w="120" w:type="dxa"/>
-              <w:left w:w="120" w:type="dxa"/>
-              <w:bottom w:w="120" w:type="dxa"/>
-              <w:right w:w="120" w:type="dxa"/>
-            </w:tcMar>
-            <w:vAlign w:val="center"/>
-          </w:tcPr>
-          <w:p>
-            <w:pPr>
-              <w:jc w:val="center"/>
-            </w:pPr>
-            <w:r>
-              <w:rPr>
-                <w:sz w:val="20"/>
-              </w:rPr>
-              <w:t>result</w:t>
-            </w:r>
-          </w:p>
-        </w:tc>
-        <w:tc>
-          <w:tcPr>
-            <w:tcW w:w="2381" w:type="dxa"/>
-            <w:tcMar>
-              <w:top w:w="120" w:type="dxa"/>
-              <w:left w:w="120" w:type="dxa"/>
-              <w:bottom w:w="120" w:type="dxa"/>
-              <w:right w:w="120" w:type="dxa"/>
-            </w:tcMar>
-            <w:vAlign w:val="center"/>
-          </w:tcPr>
-          <w:p>
-            <w:pPr>
-              <w:jc w:val="center"/>
-            </w:pPr>
-            <w:r>
-              <w:rPr>
-                <w:sz w:val="20"/>
-              </w:rPr>
-              <w:t>结果目录</w:t>
-            </w:r>
-          </w:p>
-        </w:tc>
-        <w:tc>
-          <w:tcPr>
-            <w:tcW w:w="4706" w:type="dxa"/>
-            <w:tcMar>
-              <w:top w:w="120" w:type="dxa"/>
-              <w:left w:w="120" w:type="dxa"/>
-              <w:bottom w:w="120" w:type="dxa"/>
-              <w:right w:w="120" w:type="dxa"/>
-            </w:tcMar>
-            <w:vAlign w:val="center"/>
-          </w:tcPr>
-          <w:p>
-            <w:r>
-              <w:rPr>
-                <w:sz w:val="20"/>
-              </w:rPr>
-              <w:t>算法输出和评估结果</w:t>
-            </w:r>
-          </w:p>
-        </w:tc>
-      </w:tr>
-      <w:tr>
-        <w:trPr>
-          <w:jc w:val="center"/>
-        </w:trPr>
-        <w:tc>
-          <w:tcPr>
-            <w:tcW w:w="2268" w:type="dxa"/>
-            <w:tcMar>
-              <w:top w:w="120" w:type="dxa"/>
-              <w:left w:w="120" w:type="dxa"/>
-              <w:bottom w:w="120" w:type="dxa"/>
-              <w:right w:w="120" w:type="dxa"/>
-            </w:tcMar>
-            <w:vAlign w:val="center"/>
-          </w:tcPr>
-          <w:p>
-            <w:pPr>
-              <w:jc w:val="center"/>
-            </w:pPr>
-            <w:r>
-              <w:rPr>
-                <w:sz w:val="20"/>
-              </w:rPr>
-              <w:t>video</w:t>
-            </w:r>
-          </w:p>
-        </w:tc>
-        <w:tc>
-          <w:tcPr>
-            <w:tcW w:w="2381" w:type="dxa"/>
-            <w:tcMar>
-              <w:top w:w="120" w:type="dxa"/>
-              <w:left w:w="120" w:type="dxa"/>
-              <w:bottom w:w="120" w:type="dxa"/>
-              <w:right w:w="120" w:type="dxa"/>
-            </w:tcMar>
-            <w:vAlign w:val="center"/>
-          </w:tcPr>
-          <w:p>
-            <w:pPr>
-              <w:jc w:val="center"/>
-            </w:pPr>
-            <w:r>
-              <w:rPr>
-                <w:sz w:val="20"/>
-              </w:rPr>
-              <w:t>视频目录</w:t>
-            </w:r>
-          </w:p>
-        </w:tc>
-        <w:tc>
-          <w:tcPr>
-            <w:tcW w:w="4706" w:type="dxa"/>
-            <w:tcMar>
-              <w:top w:w="120" w:type="dxa"/>
-              <w:left w:w="120" w:type="dxa"/>
-              <w:bottom w:w="120" w:type="dxa"/>
-              <w:right w:w="120" w:type="dxa"/>
-            </w:tcMar>
-            <w:vAlign w:val="center"/>
-          </w:tcPr>
-          <w:p>
-            <w:r>
-              <w:rPr>
-                <w:sz w:val="20"/>
-              </w:rPr>
-              <w:t>原始视频或测试视频</w:t>
-            </w:r>
-          </w:p>
-        </w:tc>
-      </w:tr>
-      <w:tr>
-        <w:trPr>
-          <w:jc w:val="center"/>
-        </w:trPr>
-        <w:tc>
-          <w:tcPr>
-            <w:tcW w:w="2268" w:type="dxa"/>
-            <w:tcMar>
-              <w:top w:w="120" w:type="dxa"/>
-              <w:left w:w="120" w:type="dxa"/>
-              <w:bottom w:w="120" w:type="dxa"/>
-              <w:right w:w="120" w:type="dxa"/>
-            </w:tcMar>
-            <w:vAlign w:val="center"/>
-          </w:tcPr>
-          <w:p>
-            <w:pPr>
-              <w:jc w:val="center"/>
-            </w:pPr>
-            <w:r>
-              <w:rPr>
-                <w:sz w:val="20"/>
-              </w:rPr>
-              <w:t>logs</w:t>
-            </w:r>
-          </w:p>
-        </w:tc>
-        <w:tc>
-          <w:tcPr>
-            <w:tcW w:w="2381" w:type="dxa"/>
-            <w:tcMar>
-              <w:top w:w="120" w:type="dxa"/>
-              <w:left w:w="120" w:type="dxa"/>
-              <w:bottom w:w="120" w:type="dxa"/>
-              <w:right w:w="120" w:type="dxa"/>
-            </w:tcMar>
-            <w:vAlign w:val="center"/>
-          </w:tcPr>
-          <w:p>
-            <w:pPr>
-              <w:jc w:val="center"/>
-            </w:pPr>
-            <w:r>
-              <w:rPr>
-                <w:sz w:val="20"/>
-              </w:rPr>
-              <w:t>日志目录</w:t>
-            </w:r>
-          </w:p>
-        </w:tc>
-        <w:tc>
-          <w:tcPr>
-            <w:tcW w:w="4706" w:type="dxa"/>
-            <w:tcMar>
-              <w:top w:w="120" w:type="dxa"/>
-              <w:left w:w="120" w:type="dxa"/>
-              <w:bottom w:w="120" w:type="dxa"/>
-              <w:right w:w="120" w:type="dxa"/>
-            </w:tcMar>
-            <w:vAlign w:val="center"/>
-          </w:tcPr>
-          <w:p>
-            <w:r>
-              <w:rPr>
-                <w:sz w:val="20"/>
-              </w:rPr>
-              <w:t>运行与调试日志</w:t>
-            </w:r>
-          </w:p>
-        </w:tc>
-      </w:tr>
-      <w:tr>
-        <w:trPr>
-          <w:jc w:val="center"/>
-        </w:trPr>
-        <w:tc>
-          <w:tcPr>
-            <w:tcW w:w="2268" w:type="dxa"/>
-            <w:tcMar>
-              <w:top w:w="120" w:type="dxa"/>
-              <w:left w:w="120" w:type="dxa"/>
-              <w:bottom w:w="120" w:type="dxa"/>
-              <w:right w:w="120" w:type="dxa"/>
-            </w:tcMar>
-            <w:vAlign w:val="center"/>
-          </w:tcPr>
-          <w:p>
-            <w:pPr>
-              <w:jc w:val="center"/>
-            </w:pPr>
-            <w:r>
-              <w:rPr>
-                <w:sz w:val="20"/>
-              </w:rPr>
-              <w:t>docs</w:t>
-            </w:r>
-          </w:p>
-        </w:tc>
-        <w:tc>
-          <w:tcPr>
-            <w:tcW w:w="2381" w:type="dxa"/>
-            <w:tcMar>
-              <w:top w:w="120" w:type="dxa"/>
-              <w:left w:w="120" w:type="dxa"/>
-              <w:bottom w:w="120" w:type="dxa"/>
-              <w:right w:w="120" w:type="dxa"/>
-            </w:tcMar>
-            <w:vAlign w:val="center"/>
-          </w:tcPr>
-          <w:p>
-            <w:pPr>
-              <w:jc w:val="center"/>
-            </w:pPr>
-            <w:r>
-              <w:rPr>
-                <w:sz w:val="20"/>
-              </w:rPr>
-              <w:t>文档目录</w:t>
-            </w:r>
-          </w:p>
-        </w:tc>
-        <w:tc>
-          <w:tcPr>
-            <w:tcW w:w="4706" w:type="dxa"/>
-            <w:tcMar>
-              <w:top w:w="120" w:type="dxa"/>
-              <w:left w:w="120" w:type="dxa"/>
-              <w:bottom w:w="120" w:type="dxa"/>
-              <w:right w:w="120" w:type="dxa"/>
-            </w:tcMar>
-            <w:vAlign w:val="center"/>
-          </w:tcPr>
-          <w:p>
-            <w:pPr>
-              <w:rPr>
-                <w:lang w:eastAsia="zh-CN"/>
-              </w:rPr>
-            </w:pPr>
-            <w:r>
-              <w:rPr>
-                <w:sz w:val="20"/>
-                <w:lang w:eastAsia="zh-CN"/>
-              </w:rPr>
-              <w:t>安装笔记、说明、排障记录</w:t>
-            </w:r>
-          </w:p>
-        </w:tc>
-      </w:tr>
-      <w:tr>
-        <w:trPr>
-          <w:jc w:val="center"/>
-        </w:trPr>
-        <w:tc>
-          <w:tcPr>
-            <w:tcW w:w="2268" w:type="dxa"/>
-            <w:tcMar>
-              <w:top w:w="120" w:type="dxa"/>
-              <w:left w:w="120" w:type="dxa"/>
-              <w:bottom w:w="120" w:type="dxa"/>
-              <w:right w:w="120" w:type="dxa"/>
-            </w:tcMar>
-            <w:vAlign w:val="center"/>
-          </w:tcPr>
-          <w:p>
-            <w:pPr>
-              <w:jc w:val="center"/>
-            </w:pPr>
-            <w:proofErr w:type="spellStart"/>
-            <w:r>
-              <w:rPr>
-                <w:sz w:val="20"/>
-              </w:rPr>
-              <w:t>tmp</w:t>
-            </w:r>
-            <w:proofErr w:type="spellEnd"/>
-          </w:p>
-        </w:tc>
-        <w:tc>
-          <w:tcPr>
-            <w:tcW w:w="2381" w:type="dxa"/>
-            <w:tcMar>
-              <w:top w:w="120" w:type="dxa"/>
-              <w:left w:w="120" w:type="dxa"/>
-              <w:bottom w:w="120" w:type="dxa"/>
-              <w:right w:w="120" w:type="dxa"/>
-            </w:tcMar>
-            <w:vAlign w:val="center"/>
-          </w:tcPr>
-          <w:p>
-            <w:pPr>
-              <w:jc w:val="center"/>
-            </w:pPr>
-            <w:r>
-              <w:rPr>
-                <w:sz w:val="20"/>
-              </w:rPr>
-              <w:t>临时目录</w:t>
-            </w:r>
-          </w:p>
-        </w:tc>
-        <w:tc>
-          <w:tcPr>
-            <w:tcW w:w="4706" w:type="dxa"/>
-            <w:tcMar>
-              <w:top w:w="120" w:type="dxa"/>
-              <w:left w:w="120" w:type="dxa"/>
-              <w:bottom w:w="120" w:type="dxa"/>
-              <w:right w:w="120" w:type="dxa"/>
-            </w:tcMar>
-            <w:vAlign w:val="center"/>
-          </w:tcPr>
-          <w:p>
-            <w:pPr>
-              <w:rPr>
-                <w:lang w:eastAsia="zh-CN"/>
-              </w:rPr>
-            </w:pPr>
-            <w:r>
-              <w:rPr>
-                <w:sz w:val="20"/>
-                <w:lang w:eastAsia="zh-CN"/>
-              </w:rPr>
-              <w:t>中间文件与短期测试文件</w:t>
-            </w:r>
-          </w:p>
-        </w:tc>
-      </w:tr>
-      <w:tr>
-        <w:trPr>
-          <w:jc w:val="center"/>
-        </w:trPr>
-        <w:tc>
-          <w:tcPr>
-            <w:tcW w:w="2268" w:type="dxa"/>
-            <w:tcMar>
-              <w:top w:w="120" w:type="dxa"/>
-              <w:left w:w="120" w:type="dxa"/>
-              <w:bottom w:w="120" w:type="dxa"/>
-              <w:right w:w="120" w:type="dxa"/>
-            </w:tcMar>
-            <w:vAlign w:val="center"/>
-          </w:tcPr>
-          <w:p>
-            <w:pPr>
-              <w:jc w:val="center"/>
-            </w:pPr>
-            <w:r>
-              <w:rPr>
-                <w:sz w:val="20"/>
-              </w:rPr>
-              <w:t>archive</w:t>
-            </w:r>
-          </w:p>
-        </w:tc>
-        <w:tc>
-          <w:tcPr>
-            <w:tcW w:w="2381" w:type="dxa"/>
-            <w:tcMar>
-              <w:top w:w="120" w:type="dxa"/>
-              <w:left w:w="120" w:type="dxa"/>
-              <w:bottom w:w="120" w:type="dxa"/>
-              <w:right w:w="120" w:type="dxa"/>
-            </w:tcMar>
-            <w:vAlign w:val="center"/>
-          </w:tcPr>
-          <w:p>
-            <w:pPr>
-              <w:jc w:val="center"/>
-            </w:pPr>
-            <w:r>
-              <w:rPr>
-                <w:sz w:val="20"/>
-              </w:rPr>
-              <w:t>归档目录</w:t>
-            </w:r>
-          </w:p>
-        </w:tc>
-        <w:tc>
-          <w:tcPr>
-            <w:tcW w:w="4706" w:type="dxa"/>
-            <w:tcMar>
-              <w:top w:w="120" w:type="dxa"/>
-              <w:left w:w="120" w:type="dxa"/>
-              <w:bottom w:w="120" w:type="dxa"/>
-              <w:right w:w="120" w:type="dxa"/>
-            </w:tcMar>
-            <w:vAlign w:val="center"/>
-          </w:tcPr>
-          <w:p>
-            <w:r>
-              <w:rPr>
-                <w:sz w:val="20"/>
-              </w:rPr>
-              <w:t>旧版本和废弃内容</w:t>
-            </w:r>
-          </w:p>
-        </w:tc>
-      </w:tr>
-      <w:tr>
-        <w:trPr>
-          <w:jc w:val="center"/>
-        </w:trPr>
-        <w:tc>
-          <w:tcPr>
-            <w:tcW w:w="2268" w:type="dxa"/>
-            <w:tcMar>
-              <w:top w:w="120" w:type="dxa"/>
-              <w:left w:w="120" w:type="dxa"/>
-              <w:bottom w:w="120" w:type="dxa"/>
-              <w:right w:w="120" w:type="dxa"/>
-            </w:tcMar>
-            <w:vAlign w:val="center"/>
-          </w:tcPr>
-          <w:p>
-            <w:pPr>
-              <w:jc w:val="center"/>
-            </w:pPr>
-            <w:r>
-              <w:rPr>
-                <w:sz w:val="20"/>
-              </w:rPr>
-              <w:t>Downloads</w:t>
-            </w:r>
-          </w:p>
-        </w:tc>
-        <w:tc>
-          <w:tcPr>
-            <w:tcW w:w="2381" w:type="dxa"/>
-            <w:tcMar>
-              <w:top w:w="120" w:type="dxa"/>
-              <w:left w:w="120" w:type="dxa"/>
-              <w:bottom w:w="120" w:type="dxa"/>
-              <w:right w:w="120" w:type="dxa"/>
-            </w:tcMar>
-            <w:vAlign w:val="center"/>
-          </w:tcPr>
-          <w:p>
-            <w:pPr>
-              <w:jc w:val="center"/>
-            </w:pPr>
-            <w:r>
-              <w:rPr>
-                <w:sz w:val="20"/>
-              </w:rPr>
-              <w:t>下载目录</w:t>
-            </w:r>
-          </w:p>
-        </w:tc>
-        <w:tc>
-          <w:tcPr>
-            <w:tcW w:w="4706" w:type="dxa"/>
-            <w:tcMar>
-              <w:top w:w="120" w:type="dxa"/>
-              <w:left w:w="120" w:type="dxa"/>
-              <w:bottom w:w="120" w:type="dxa"/>
-              <w:right w:w="120" w:type="dxa"/>
-            </w:tcMar>
-            <w:vAlign w:val="center"/>
-          </w:tcPr>
-          <w:p>
-            <w:pPr>
-              <w:rPr>
-                <w:lang w:eastAsia="zh-CN"/>
-              </w:rPr>
-            </w:pPr>
-            <w:r>
-              <w:rPr>
-                <w:sz w:val="20"/>
-                <w:lang w:eastAsia="zh-CN"/>
-              </w:rPr>
-              <w:t>临时下载区，不建议放正式工程</w:t>
-            </w:r>
-          </w:p>
-        </w:tc>
-      </w:tr>
-      <w:tr>
-        <w:trPr>
-          <w:jc w:val="center"/>
-        </w:trPr>
-        <w:tc>
-          <w:tcPr>
-            <w:tcW w:w="2268" w:type="dxa"/>
-            <w:tcMar>
-              <w:top w:w="120" w:type="dxa"/>
-              <w:left w:w="120" w:type="dxa"/>
-              <w:bottom w:w="120" w:type="dxa"/>
-              <w:right w:w="120" w:type="dxa"/>
-            </w:tcMar>
-            <w:vAlign w:val="center"/>
-          </w:tcPr>
-          <w:p>
-            <w:pPr>
-              <w:jc w:val="center"/>
-            </w:pPr>
-            <w:r>
-              <w:rPr>
-                <w:sz w:val="20"/>
-              </w:rPr>
-              <w:t>Desktop</w:t>
-            </w:r>
-          </w:p>
-        </w:tc>
-        <w:tc>
-          <w:tcPr>
-            <w:tcW w:w="2381" w:type="dxa"/>
-            <w:tcMar>
-              <w:top w:w="120" w:type="dxa"/>
-              <w:left w:w="120" w:type="dxa"/>
-              <w:bottom w:w="120" w:type="dxa"/>
-              <w:right w:w="120" w:type="dxa"/>
-            </w:tcMar>
-            <w:vAlign w:val="center"/>
-          </w:tcPr>
-          <w:p>
-            <w:pPr>
-              <w:jc w:val="center"/>
-            </w:pPr>
-            <w:r>
-              <w:rPr>
-                <w:sz w:val="20"/>
-              </w:rPr>
-              <w:t>桌面目录</w:t>
-            </w:r>
-          </w:p>
-        </w:tc>
-        <w:tc>
-          <w:tcPr>
-            <w:tcW w:w="4706" w:type="dxa"/>
-            <w:tcMar>
-              <w:top w:w="120" w:type="dxa"/>
-              <w:left w:w="120" w:type="dxa"/>
-              <w:bottom w:w="120" w:type="dxa"/>
-              <w:right w:w="120" w:type="dxa"/>
-            </w:tcMar>
-            <w:vAlign w:val="center"/>
-          </w:tcPr>
-          <w:p>
-            <w:r>
-              <w:rPr>
-                <w:sz w:val="20"/>
-              </w:rPr>
-              <w:t>桌面显示文件</w:t>
-            </w:r>
-          </w:p>
-        </w:tc>
-      </w:tr>
-    </w:tbl>
-    <w:p/>
+    <w:p>
+      <w:pPr>
+        <w:pStyle w:val="Mono"/>
+      </w:pPr>
+      <w:r>
+        <w:t xml:space="preserve">cd /home/orangepi/projects/uav_stack</w:t>
+      </w:r>
+      <w:r>
+        <w:br/>
+      </w:r>
+      <w:r>
+        <w:t xml:space="preserve">source catkin_ws/devel/setup.bash</w:t>
+      </w:r>
+      <w:r>
+        <w:br/>
+      </w:r>
+      <w:r>
+        <w:t xml:space="preserve">roslaunch /home/orangepi/projects/uav_stack/launch/rs_camera.launch</w:t>
+      </w:r>
+      <w:r>
+        <w:br/>
+      </w:r>
+      <w:r>
+        <w:t xml:space="preserve">roslaunch /home/orangepi/projects/uav_stack/launch/imu_transform.launch</w:t>
+      </w:r>
+      <w:r>
+        <w:br/>
+      </w:r>
+      <w:r>
+        <w:t xml:space="preserve">roslaunch /home/orangepi/projects/uav_stack/launch/vins_node.launch</w:t>
+      </w:r>
+      <w:r>
+        <w:br/>
+      </w:r>
+      <w:r>
+        <w:t xml:space="preserve">roslaunch /home/orangepi/projects/uav_stack/launch/px4.launch</w:t>
+      </w:r>
+      <w:r>
+        <w:br/>
+      </w:r>
+      <w:r>
+        <w:t xml:space="preserve">roslaunch /home/orangepi/projects/uav_stack/launch/vins_to_mavros.launch</w:t>
+      </w:r>
+      <w:r>
+        <w:br/>
+      </w:r>
+      <w:r>
+        <w:t xml:space="preserve">roslaunch /home/orangepi/projects/uav_stack/launch/vins_rviz.launch</w:t>
+      </w:r>
+    </w:p>
+    <w:p>
+      <w:r>
+        <w:t xml:space="preserve">实际飞行或上电测试时，应先确认 PX4 串口设备名和波特率，再启动 px4.launch。当前默认串口为 /dev/ttyUSB0:921600。</w:t>
+      </w:r>
+    </w:p>
     <w:p>
       <w:pPr>
         <w:pStyle w:val="1"/>
       </w:pPr>
       <w:r>
-        <w:t>四、使用建议</w:t>
+        <w:t xml:space="preserve">八、版本管理规则</w:t>
+      </w:r>
+    </w:p>
+    <w:p>
+      <w:r>
+        <w:t xml:space="preserve">.gitignore 已排除 catkin_ws/build、catkin_ws/devel、catkin_ws/logs、third_party 构建产物、*.bag、*.db3、模型大文件、日志、Python 缓存、IDE 文件和常见编译产物。</w:t>
+      </w:r>
+    </w:p>
+    <w:p>
+      <w:r>
+        <w:t xml:space="preserve">建议纳入 git 的内容：ROS 包源码、可复现的 launch/yaml/config、小型脚本、README、docs 和本手册。建议不纳入 git 的内容：rosbag、训练/推理模型、构建目录、临时结果、大型数据集和运行日志。</w:t>
+      </w:r>
+    </w:p>
+    <w:p>
+      <w:r>
+        <w:t xml:space="preserve">当前本机 launch/、yaml/、config/、scripts/ 是运行入口和配置镜像；若希望 GitHub 仓库对其他设备可直接复现，应显式 git add 需要共享的入口文件，而不是依赖本机未跟踪文件。</w:t>
       </w:r>
     </w:p>
     <w:p>
       <w:pPr>
-        <w:pStyle w:val="a0"/>
+        <w:pStyle w:val="1"/>
       </w:pPr>
       <w:r>
-        <w:t>新增 ROS 功能包时，只放到 catkin_ws/src/。</w:t>
+        <w:t xml:space="preserve">九、当前需要重点核对的工程点</w:t>
       </w:r>
     </w:p>
     <w:p>
-      <w:pPr>
-        <w:pStyle w:val="a0"/>
-      </w:pPr>
-      <w:r>
-        <w:t>新增第三方库源码时，只放到 third_party/。</w:t>
+      <w:r>
+        <w:t xml:space="preserve">1. VINS 配置当前订阅 /camera/imu，但 imu_transform 脚本输出 /imu/data_flu；如果计划使用转换后的 FLU IMU 数据，需要同步修改 yaml/realsense_stereo_imu_config.yaml 中的 imu_topic。</w:t>
       </w:r>
     </w:p>
     <w:p>
-      <w:pPr>
-        <w:pStyle w:val="a0"/>
-      </w:pPr>
-      <w:r>
-        <w:lastRenderedPageBreak/>
-        <w:t>改过的关键 yaml、launch、PX4 参数，建议同步备份到 config/。</w:t>
+      <w:r>
+        <w:t xml:space="preserve">2. vins_to_mavros.cpp 中 base_link -&gt; camera_link 静态外参为 x=0.09、z=0.04；如果机械安装或相机标定发生变化，应同时核对桥接 TF 与 VINS 外参配置。</w:t>
       </w:r>
     </w:p>
     <w:p>
-      <w:pPr>
-        <w:pStyle w:val="a0"/>
-      </w:pPr>
-      <w:r>
-        <w:t>融合异常、轨迹异常、TF 可疑时，优先录 rosbag，放到 data/rosbag/。</w:t>
+      <w:r>
+        <w:t xml:space="preserve">3. yaml/realsense_stereo_imu_config.yaml 中 output_path 与 pose_graph_save_path 指向 /home/dji/output/；在当前 /home/orangepi 环境下应确认路径权限和目录存在性。</w:t>
       </w:r>
     </w:p>
     <w:p>
-      <w:pPr>
-        <w:pStyle w:val="a0"/>
-        <w:rPr>
-          <w:lang w:eastAsia="zh-CN"/>
-        </w:rPr>
-      </w:pPr>
-      <w:r>
-        <w:rPr>
-          <w:lang w:eastAsia="zh-CN"/>
-        </w:rPr>
-        <w:t>确认旧版本暂时不用时，不直接删除，先挪到 archive/。</w:t>
-      </w:r>
-    </w:p>
-    <w:p>
-      <w:pPr>
-        <w:rPr>
-          <w:lang w:eastAsia="zh-CN"/>
-        </w:rPr>
-      </w:pPr>
-    </w:p>
-    <w:p>
-      <w:pPr>
-        <w:pStyle w:val="Note"/>
-        <w:rPr>
-          <w:lang w:eastAsia="zh-CN"/>
-        </w:rPr>
-      </w:pPr>
-      <w:proofErr w:type="spellStart"/>
-      <w:r>
-        <w:rPr>
-          <w:lang w:eastAsia="zh-CN"/>
-        </w:rPr>
-        <w:t>mkdir</w:t>
-      </w:r>
-      <w:proofErr w:type="spellEnd"/>
-      <w:r>
-        <w:rPr>
-          <w:lang w:eastAsia="zh-CN"/>
-        </w:rPr>
-        <w:t xml:space="preserve"> -p ~/projects/uav_stack/{catkin_ws/src,third_party,models/{yolo,backup},config/{realsense,vins,px4,yolo},scripts,data/{rosbag,calibration,dataset,result,video},logs,docs,tmp,archive}</w:t>
-      </w:r>
-    </w:p>
-    <w:p>
-      <w:pPr>
-        <w:pStyle w:val="Note"/>
-      </w:pPr>
-      <w:r>
-        <w:rPr>
-          <w:lang w:eastAsia="zh-CN"/>
-        </w:rPr>
-        <w:t>tree -L 3 ~/projects/</w:t>
-      </w:r>
-      <w:proofErr w:type="spellStart"/>
-      <w:r>
-        <w:rPr>
-          <w:lang w:eastAsia="zh-CN"/>
-        </w:rPr>
-        <w:t>uav_stack</w:t>
-      </w:r>
-      <w:proofErr w:type="spellEnd"/>
+      <w:r>
+        <w:t xml:space="preserve">4. 根目录 launch/yaml/config/scripts 如果还未进入 git，GitHub 只会收到已提交内容；远程复现前需要确认这些运行入口是否已经提交。</w:t>
+      </w:r>
     </w:p>
     <w:sectPr>
       <w:pgSz w:w="12240" w:h="15840"/>

</xml_diff>